<commit_message>
chore(submission): mentor3 bundle — feedback #2 addressed + FEEDBACK_RESPONSE.md
- submission/mentor3/FEEDBACK_RESPONSE.md: new feedback response doc
- All 5 submission files refreshed from latest build (Sep 30)
- output/: updated CoverLetter.pdf and MajorReport.pdf (glossary fix)
</commit_message>
<xml_diff>
--- a/submission/mentor3/BhavikBhagat_A00494758_MajorReport.docx
+++ b/submission/mentor3/BhavikBhagat_A00494758_MajorReport.docx
@@ -1019,8 +1019,8 @@
         <w:br w:type="page"/>
       </w:r>
     </w:p>
-    <w:bookmarkStart w:id="2" w:name="_Toc241455976" w:displacedByCustomXml="next"/>
-    <w:bookmarkStart w:id="3" w:name="_Toc241017886" w:displacedByCustomXml="next"/>
+    <w:bookmarkStart w:id="2" w:name="_Toc241017886" w:displacedByCustomXml="next"/>
+    <w:bookmarkStart w:id="3" w:name="_Toc241455976" w:displacedByCustomXml="next"/>
     <w:sdt>
       <w:sdtPr>
         <w:rPr>
@@ -15345,15 +15345,7 @@
         <w:t xml:space="preserve">Technical Communication and Documentation. </w:t>
       </w:r>
       <w:r>
-        <w:t>Produce engineering-grade written deliverables: incident RCA reports, architecture design documents, Confluence knowledge-</w:t>
-      </w:r>
-      <w:proofErr w:type="spellStart"/>
-      <w:r>
-        <w:t>base</w:t>
-      </w:r>
-      <w:proofErr w:type="spellEnd"/>
-      <w:r>
-        <w:t xml:space="preserve"> pages, runbooks, and this academic report.</w:t>
+        <w:t>Produce engineering-grade written deliverables: incident RCA reports, architecture design documents, Confluence knowledge-base pages, runbooks, and this academic report.</w:t>
       </w:r>
     </w:p>
     <w:p>
@@ -26284,27 +26276,14 @@
       <w:r>
         <w:t xml:space="preserve">Figure </w:t>
       </w:r>
-      <w:r>
-        <w:fldChar w:fldCharType="begin"/>
-      </w:r>
-      <w:r>
-        <w:instrText xml:space="preserve"> SEQ Figure \* ARABIC </w:instrText>
-      </w:r>
-      <w:r>
-        <w:fldChar w:fldCharType="separate"/>
-      </w:r>
-      <w:r>
-        <w:rPr>
-          <w:noProof/>
-        </w:rPr>
-        <w:t>9</w:t>
-      </w:r>
-      <w:r>
-        <w:rPr>
-          <w:noProof/>
-        </w:rPr>
-        <w:fldChar w:fldCharType="end"/>
-      </w:r>
+      <w:fldSimple w:instr=" SEQ Figure \* ARABIC ">
+        <w:r>
+          <w:rPr>
+            <w:noProof/>
+          </w:rPr>
+          <w:t>9</w:t>
+        </w:r>
+      </w:fldSimple>
       <w:bookmarkEnd w:id="89"/>
       <w:r>
         <w:t>: Alarm Notification Flow — CloudWatch to SNS to Email Distribution</w:t>
@@ -32324,15 +32303,7 @@
         <w:t>ing</w:t>
       </w:r>
       <w:r>
-        <w:t xml:space="preserve"> was conducted by the Red Team on UAT only to protect production uptime); and the access logging infrastructure built on the ELK stack (Kibana, Elasticsearch) with 7–</w:t>
-      </w:r>
-      <w:proofErr w:type="gramStart"/>
-      <w:r>
-        <w:t>14 day</w:t>
-      </w:r>
-      <w:proofErr w:type="gramEnd"/>
-      <w:r>
-        <w:t xml:space="preserve"> log retention policies. I also learned about Dynatrace application monitoring for anomaly detection and alerting—knowledge that would become directly relevant when I later evaluated Dynatrace parity as a framing question for the Grafana AMG dashboard work.</w:t>
+        <w:t xml:space="preserve"> was conducted by the Red Team on UAT only to protect production uptime); and the access logging infrastructure built on the ELK stack (Kibana, Elasticsearch) with 7–14 day log retention policies. I also learned about Dynatrace application monitoring for anomaly detection and alerting—knowledge that would become directly relevant when I later evaluated Dynatrace parity as a framing question for the Grafana AMG dashboard work.</w:t>
       </w:r>
     </w:p>
     <w:p>
@@ -49863,7 +49834,10 @@
         <w:pStyle w:val="SubSection"/>
       </w:pPr>
       <w:r>
-        <w:t>4.3</w:t>
+        <w:t>A</w:t>
+      </w:r>
+      <w:r>
+        <w:t>.3</w:t>
       </w:r>
       <w:r>
         <w:tab/>

</xml_diff>

<commit_message>
add: word doc w/ some formatting applied
</commit_message>
<xml_diff>
--- a/submission/mentor3/BhavikBhagat_A00494758_MajorReport.docx
+++ b/submission/mentor3/BhavikBhagat_A00494758_MajorReport.docx
@@ -1019,8 +1019,8 @@
         <w:br w:type="page"/>
       </w:r>
     </w:p>
-    <w:bookmarkStart w:id="2" w:name="_Toc241017886" w:displacedByCustomXml="next"/>
-    <w:bookmarkStart w:id="3" w:name="_Toc241455976" w:displacedByCustomXml="next"/>
+    <w:bookmarkStart w:id="2" w:name="_Toc241455976" w:displacedByCustomXml="next"/>
+    <w:bookmarkStart w:id="3" w:name="_Toc241017886" w:displacedByCustomXml="next"/>
     <w:sdt>
       <w:sdtPr>
         <w:rPr>
@@ -11055,6 +11055,7 @@
           <w:ilvl w:val="0"/>
           <w:numId w:val="8"/>
         </w:numPr>
+        <w:spacing w:after="0"/>
         <w:ind w:right="-94"/>
       </w:pPr>
       <w:r>
@@ -11074,6 +11075,7 @@
           <w:ilvl w:val="0"/>
           <w:numId w:val="8"/>
         </w:numPr>
+        <w:spacing w:after="0"/>
         <w:ind w:right="-94"/>
       </w:pPr>
       <w:r>
@@ -11099,6 +11101,7 @@
           <w:ilvl w:val="0"/>
           <w:numId w:val="8"/>
         </w:numPr>
+        <w:spacing w:after="0"/>
         <w:ind w:right="-94"/>
       </w:pPr>
       <w:r>
@@ -11130,6 +11133,7 @@
           <w:ilvl w:val="0"/>
           <w:numId w:val="8"/>
         </w:numPr>
+        <w:spacing w:after="0"/>
         <w:ind w:right="-94"/>
       </w:pPr>
       <w:r>
@@ -11149,6 +11153,7 @@
           <w:ilvl w:val="0"/>
           <w:numId w:val="8"/>
         </w:numPr>
+        <w:spacing w:after="0"/>
         <w:ind w:right="-94"/>
       </w:pPr>
       <w:r>
@@ -11174,13 +11179,13 @@
           <w:ilvl w:val="0"/>
           <w:numId w:val="8"/>
         </w:numPr>
+        <w:spacing w:after="0"/>
         <w:ind w:right="-94"/>
       </w:pPr>
       <w:r>
         <w:rPr>
           <w:b/>
         </w:rPr>
-        <w:lastRenderedPageBreak/>
         <w:t xml:space="preserve">JIRA Story Creation and Management: </w:t>
       </w:r>
       <w:r>
@@ -11194,12 +11199,14 @@
           <w:ilvl w:val="0"/>
           <w:numId w:val="8"/>
         </w:numPr>
+        <w:spacing w:after="0"/>
         <w:ind w:right="-94"/>
       </w:pPr>
       <w:r>
         <w:rPr>
           <w:b/>
         </w:rPr>
+        <w:lastRenderedPageBreak/>
         <w:t xml:space="preserve">RPA Production Support: </w:t>
       </w:r>
       <w:r>
@@ -11213,6 +11220,7 @@
           <w:ilvl w:val="0"/>
           <w:numId w:val="8"/>
         </w:numPr>
+        <w:spacing w:after="0"/>
         <w:ind w:right="-94"/>
       </w:pPr>
       <w:r>
@@ -11232,6 +11240,7 @@
           <w:ilvl w:val="0"/>
           <w:numId w:val="8"/>
         </w:numPr>
+        <w:spacing w:after="0"/>
         <w:ind w:right="-94"/>
       </w:pPr>
       <w:r>
@@ -11257,6 +11266,7 @@
           <w:ilvl w:val="0"/>
           <w:numId w:val="8"/>
         </w:numPr>
+        <w:spacing w:after="0"/>
         <w:ind w:right="-94"/>
       </w:pPr>
       <w:r>
@@ -11320,7 +11330,6 @@
       </w:pPr>
       <w:bookmarkStart w:id="16" w:name="_Toc241455987"/>
       <w:r>
-        <w:lastRenderedPageBreak/>
         <w:t>4.1</w:t>
       </w:r>
       <w:r>
@@ -11336,6 +11345,7 @@
           <w:ilvl w:val="0"/>
           <w:numId w:val="9"/>
         </w:numPr>
+        <w:spacing w:after="0"/>
         <w:ind w:right="-94"/>
       </w:pPr>
       <w:r>
@@ -11356,6 +11366,7 @@
           <w:ilvl w:val="0"/>
           <w:numId w:val="9"/>
         </w:numPr>
+        <w:spacing w:after="0"/>
         <w:ind w:right="-94"/>
       </w:pPr>
       <w:r>
@@ -11376,6 +11387,7 @@
           <w:ilvl w:val="0"/>
           <w:numId w:val="9"/>
         </w:numPr>
+        <w:spacing w:after="0"/>
         <w:ind w:right="-94"/>
       </w:pPr>
       <w:r>
@@ -11383,6 +11395,7 @@
           <w:b/>
           <w:bCs/>
         </w:rPr>
+        <w:lastRenderedPageBreak/>
         <w:t>AWS Lambda</w:t>
       </w:r>
       <w:r>
@@ -11402,6 +11415,7 @@
           <w:ilvl w:val="0"/>
           <w:numId w:val="9"/>
         </w:numPr>
+        <w:spacing w:after="0"/>
         <w:ind w:right="-94"/>
       </w:pPr>
       <w:r>
@@ -11440,6 +11454,7 @@
           <w:ilvl w:val="0"/>
           <w:numId w:val="9"/>
         </w:numPr>
+        <w:spacing w:after="0"/>
         <w:ind w:right="-94"/>
       </w:pPr>
       <w:r>
@@ -11472,6 +11487,7 @@
           <w:ilvl w:val="0"/>
           <w:numId w:val="9"/>
         </w:numPr>
+        <w:spacing w:after="0"/>
         <w:ind w:right="-94"/>
       </w:pPr>
       <w:r>
@@ -11498,6 +11514,7 @@
           <w:ilvl w:val="0"/>
           <w:numId w:val="9"/>
         </w:numPr>
+        <w:spacing w:after="0"/>
         <w:ind w:right="-94"/>
       </w:pPr>
       <w:r>
@@ -11518,6 +11535,7 @@
           <w:ilvl w:val="0"/>
           <w:numId w:val="9"/>
         </w:numPr>
+        <w:spacing w:after="0"/>
         <w:ind w:right="-94"/>
       </w:pPr>
       <w:r>
@@ -11538,6 +11556,7 @@
           <w:ilvl w:val="0"/>
           <w:numId w:val="9"/>
         </w:numPr>
+        <w:spacing w:after="0"/>
         <w:ind w:right="-94"/>
       </w:pPr>
       <w:r>
@@ -11564,6 +11583,7 @@
           <w:ilvl w:val="0"/>
           <w:numId w:val="9"/>
         </w:numPr>
+        <w:spacing w:after="0"/>
         <w:ind w:right="-94"/>
       </w:pPr>
       <w:r>
@@ -11571,7 +11591,6 @@
           <w:b/>
           <w:bCs/>
         </w:rPr>
-        <w:lastRenderedPageBreak/>
         <w:t>Amazon ECR (Elastic Container Registry)</w:t>
       </w:r>
       <w:r>
@@ -11585,6 +11604,7 @@
           <w:ilvl w:val="0"/>
           <w:numId w:val="9"/>
         </w:numPr>
+        <w:spacing w:after="0"/>
         <w:ind w:right="-94"/>
       </w:pPr>
       <w:r>
@@ -11611,6 +11631,7 @@
           <w:ilvl w:val="0"/>
           <w:numId w:val="9"/>
         </w:numPr>
+        <w:spacing w:after="0"/>
         <w:ind w:right="-94"/>
       </w:pPr>
       <w:r>
@@ -11637,6 +11658,7 @@
           <w:ilvl w:val="0"/>
           <w:numId w:val="9"/>
         </w:numPr>
+        <w:spacing w:after="0"/>
         <w:ind w:right="-94"/>
       </w:pPr>
       <w:r>
@@ -11663,6 +11685,7 @@
           <w:ilvl w:val="0"/>
           <w:numId w:val="9"/>
         </w:numPr>
+        <w:spacing w:after="0"/>
         <w:ind w:right="-94"/>
       </w:pPr>
       <w:r>
@@ -11689,6 +11712,7 @@
           <w:ilvl w:val="0"/>
           <w:numId w:val="9"/>
         </w:numPr>
+        <w:spacing w:after="0"/>
         <w:ind w:right="-94"/>
       </w:pPr>
       <w:r>
@@ -11696,6 +11720,7 @@
           <w:b/>
           <w:bCs/>
         </w:rPr>
+        <w:lastRenderedPageBreak/>
         <w:t>Amazon ElastiCache (Redis/Valkey)</w:t>
       </w:r>
       <w:r>
@@ -11715,6 +11740,7 @@
           <w:ilvl w:val="0"/>
           <w:numId w:val="9"/>
         </w:numPr>
+        <w:spacing w:after="0"/>
         <w:ind w:right="-94"/>
       </w:pPr>
       <w:r>
@@ -11735,6 +11761,7 @@
           <w:ilvl w:val="0"/>
           <w:numId w:val="9"/>
         </w:numPr>
+        <w:spacing w:after="0"/>
         <w:ind w:right="-94"/>
       </w:pPr>
       <w:r>
@@ -11755,6 +11782,7 @@
           <w:ilvl w:val="0"/>
           <w:numId w:val="9"/>
         </w:numPr>
+        <w:spacing w:after="0"/>
         <w:ind w:right="-94"/>
       </w:pPr>
       <w:r>
@@ -11775,6 +11803,7 @@
           <w:ilvl w:val="0"/>
           <w:numId w:val="9"/>
         </w:numPr>
+        <w:spacing w:after="0"/>
         <w:ind w:right="-94"/>
       </w:pPr>
       <w:r>
@@ -11810,6 +11839,7 @@
           <w:ilvl w:val="0"/>
           <w:numId w:val="10"/>
         </w:numPr>
+        <w:spacing w:after="0"/>
         <w:ind w:right="-94"/>
       </w:pPr>
       <w:r>
@@ -11831,11 +11861,7 @@
         <w:t xml:space="preserve">CloudWatch Container Insights </w:t>
       </w:r>
       <w:r>
-        <w:t xml:space="preserve">— Managed </w:t>
-      </w:r>
-      <w:r>
-        <w:lastRenderedPageBreak/>
-        <w:t xml:space="preserve">telemetry extension for ECS and EKS that surfaces task-level CPU, memory, and network metrics, enabled on the </w:t>
+        <w:t xml:space="preserve">— Managed telemetry extension for ECS and EKS that surfaces task-level CPU, memory, and network metrics, enabled on the </w:t>
       </w:r>
       <w:r>
         <w:t>Meridian</w:t>
@@ -11851,6 +11877,7 @@
           <w:ilvl w:val="0"/>
           <w:numId w:val="10"/>
         </w:numPr>
+        <w:spacing w:after="0"/>
         <w:ind w:right="-94"/>
       </w:pPr>
       <w:r>
@@ -11870,6 +11897,7 @@
           <w:ilvl w:val="0"/>
           <w:numId w:val="10"/>
         </w:numPr>
+        <w:spacing w:after="0"/>
         <w:ind w:right="-94"/>
       </w:pPr>
       <w:r>
@@ -11898,6 +11926,7 @@
           <w:ilvl w:val="0"/>
           <w:numId w:val="10"/>
         </w:numPr>
+        <w:spacing w:after="0"/>
         <w:ind w:right="-94"/>
       </w:pPr>
       <w:r>
@@ -11932,6 +11961,7 @@
           <w:ilvl w:val="0"/>
           <w:numId w:val="11"/>
         </w:numPr>
+        <w:spacing w:after="0"/>
         <w:ind w:right="-94"/>
       </w:pPr>
       <w:r>
@@ -11951,12 +11981,14 @@
           <w:ilvl w:val="0"/>
           <w:numId w:val="11"/>
         </w:numPr>
+        <w:spacing w:after="0"/>
         <w:ind w:right="-94"/>
       </w:pPr>
       <w:r>
         <w:rPr>
           <w:b/>
         </w:rPr>
+        <w:lastRenderedPageBreak/>
         <w:t xml:space="preserve">boto3 </w:t>
       </w:r>
       <w:r>
@@ -11970,6 +12002,7 @@
           <w:ilvl w:val="0"/>
           <w:numId w:val="11"/>
         </w:numPr>
+        <w:spacing w:after="0"/>
         <w:ind w:right="-94"/>
       </w:pPr>
       <w:r>
@@ -11989,6 +12022,7 @@
           <w:ilvl w:val="0"/>
           <w:numId w:val="11"/>
         </w:numPr>
+        <w:spacing w:after="0"/>
         <w:ind w:right="-94"/>
       </w:pPr>
       <w:r>
@@ -12008,6 +12042,7 @@
           <w:ilvl w:val="0"/>
           <w:numId w:val="11"/>
         </w:numPr>
+        <w:spacing w:after="0"/>
         <w:ind w:right="-94"/>
       </w:pPr>
       <w:r>
@@ -12027,6 +12062,7 @@
           <w:ilvl w:val="0"/>
           <w:numId w:val="11"/>
         </w:numPr>
+        <w:spacing w:after="0"/>
         <w:ind w:right="-94"/>
       </w:pPr>
       <w:r>
@@ -12094,13 +12130,13 @@
           <w:ilvl w:val="0"/>
           <w:numId w:val="11"/>
         </w:numPr>
+        <w:spacing w:after="0"/>
         <w:ind w:right="-94"/>
       </w:pPr>
       <w:r>
         <w:rPr>
           <w:b/>
         </w:rPr>
-        <w:lastRenderedPageBreak/>
         <w:t xml:space="preserve">TypeScript / ReactJS / MUI </w:t>
       </w:r>
       <w:r>
@@ -12114,6 +12150,7 @@
           <w:ilvl w:val="0"/>
           <w:numId w:val="11"/>
         </w:numPr>
+        <w:spacing w:after="0"/>
         <w:ind w:right="-94"/>
       </w:pPr>
       <w:r>
@@ -12133,6 +12170,7 @@
           <w:ilvl w:val="0"/>
           <w:numId w:val="11"/>
         </w:numPr>
+        <w:spacing w:after="0"/>
         <w:ind w:right="-94"/>
       </w:pPr>
       <w:r>
@@ -12152,6 +12190,7 @@
           <w:ilvl w:val="0"/>
           <w:numId w:val="11"/>
         </w:numPr>
+        <w:spacing w:after="0"/>
         <w:ind w:right="-94"/>
       </w:pPr>
       <w:r>
@@ -12171,6 +12210,7 @@
           <w:ilvl w:val="0"/>
           <w:numId w:val="11"/>
         </w:numPr>
+        <w:spacing w:after="0"/>
         <w:ind w:right="-94"/>
       </w:pPr>
       <w:r>
@@ -12262,6 +12302,7 @@
           <w:ilvl w:val="0"/>
           <w:numId w:val="11"/>
         </w:numPr>
+        <w:spacing w:after="0"/>
         <w:ind w:right="-94"/>
       </w:pPr>
       <w:r>
@@ -12281,6 +12322,7 @@
           <w:ilvl w:val="0"/>
           <w:numId w:val="11"/>
         </w:numPr>
+        <w:spacing w:after="0"/>
         <w:ind w:right="-94"/>
       </w:pPr>
       <w:r>
@@ -12312,6 +12354,7 @@
           <w:ilvl w:val="0"/>
           <w:numId w:val="11"/>
         </w:numPr>
+        <w:spacing w:after="0"/>
         <w:ind w:right="-94"/>
       </w:pPr>
       <w:r>
@@ -12331,12 +12374,14 @@
           <w:ilvl w:val="0"/>
           <w:numId w:val="11"/>
         </w:numPr>
+        <w:spacing w:after="0"/>
         <w:ind w:right="-94"/>
       </w:pPr>
       <w:r>
         <w:rPr>
           <w:b/>
         </w:rPr>
+        <w:lastRenderedPageBreak/>
         <w:t xml:space="preserve">Visual Studio Code (VS Code) </w:t>
       </w:r>
       <w:r>
@@ -12350,6 +12395,7 @@
           <w:ilvl w:val="0"/>
           <w:numId w:val="11"/>
         </w:numPr>
+        <w:spacing w:after="0"/>
         <w:ind w:right="-94"/>
       </w:pPr>
       <w:r>
@@ -12369,6 +12415,7 @@
           <w:ilvl w:val="0"/>
           <w:numId w:val="11"/>
         </w:numPr>
+        <w:spacing w:after="0"/>
         <w:ind w:right="-94"/>
       </w:pPr>
       <w:r>
@@ -12388,13 +12435,13 @@
           <w:ilvl w:val="0"/>
           <w:numId w:val="11"/>
         </w:numPr>
+        <w:spacing w:after="0"/>
         <w:ind w:right="-94"/>
       </w:pPr>
       <w:r>
         <w:rPr>
           <w:b/>
         </w:rPr>
-        <w:lastRenderedPageBreak/>
         <w:t xml:space="preserve">Git / AWS CodeCommit / Bitbucket </w:t>
       </w:r>
       <w:r>
@@ -12408,6 +12455,7 @@
           <w:ilvl w:val="0"/>
           <w:numId w:val="11"/>
         </w:numPr>
+        <w:spacing w:after="0"/>
         <w:ind w:right="-94"/>
       </w:pPr>
       <w:r>
@@ -12442,6 +12490,7 @@
           <w:ilvl w:val="0"/>
           <w:numId w:val="12"/>
         </w:numPr>
+        <w:spacing w:after="0"/>
         <w:ind w:right="-94"/>
       </w:pPr>
       <w:r>
@@ -12479,6 +12528,7 @@
           <w:ilvl w:val="0"/>
           <w:numId w:val="12"/>
         </w:numPr>
+        <w:spacing w:after="0"/>
         <w:ind w:right="-94"/>
       </w:pPr>
       <w:r>
@@ -12504,6 +12554,7 @@
           <w:ilvl w:val="0"/>
           <w:numId w:val="12"/>
         </w:numPr>
+        <w:spacing w:after="0"/>
         <w:ind w:right="-94"/>
       </w:pPr>
       <w:r>
@@ -12523,6 +12574,7 @@
           <w:ilvl w:val="0"/>
           <w:numId w:val="12"/>
         </w:numPr>
+        <w:spacing w:after="0"/>
         <w:ind w:right="-94"/>
       </w:pPr>
       <w:r>
@@ -12571,6 +12623,7 @@
           <w:ilvl w:val="0"/>
           <w:numId w:val="13"/>
         </w:numPr>
+        <w:spacing w:after="0"/>
         <w:ind w:right="-94"/>
       </w:pPr>
       <w:r>
@@ -12590,6 +12643,7 @@
           <w:ilvl w:val="0"/>
           <w:numId w:val="13"/>
         </w:numPr>
+        <w:spacing w:after="0"/>
         <w:ind w:right="-94"/>
       </w:pPr>
       <w:r>
@@ -12609,6 +12663,7 @@
       </w:pPr>
       <w:bookmarkStart w:id="21" w:name="_Toc241455992"/>
       <w:r>
+        <w:lastRenderedPageBreak/>
         <w:t>4.6</w:t>
       </w:r>
       <w:r>
@@ -12624,6 +12679,7 @@
           <w:ilvl w:val="0"/>
           <w:numId w:val="14"/>
         </w:numPr>
+        <w:spacing w:after="0"/>
         <w:ind w:right="-94"/>
       </w:pPr>
       <w:r>
@@ -12649,13 +12705,13 @@
           <w:ilvl w:val="0"/>
           <w:numId w:val="14"/>
         </w:numPr>
+        <w:spacing w:after="0"/>
         <w:ind w:right="-94"/>
       </w:pPr>
       <w:r>
         <w:rPr>
           <w:b/>
         </w:rPr>
-        <w:lastRenderedPageBreak/>
         <w:t xml:space="preserve">Microsoft Outlook </w:t>
       </w:r>
       <w:r>
@@ -12811,7 +12867,11 @@
         <w:t xml:space="preserve"> </w:t>
       </w:r>
       <w:r>
-        <w:t xml:space="preserve">A sub-task was assigned directly to me as </w:t>
+        <w:t xml:space="preserve">A sub-task was </w:t>
+      </w:r>
+      <w:r>
+        <w:lastRenderedPageBreak/>
+        <w:t xml:space="preserve">assigned directly to me as </w:t>
       </w:r>
       <w:r>
         <w:t>immediate</w:t>
@@ -12825,7 +12885,6 @@
         <w:pStyle w:val="SubSection"/>
       </w:pPr>
       <w:r>
-        <w:lastRenderedPageBreak/>
         <w:t>5.1.3</w:t>
       </w:r>
       <w:r>
@@ -13490,7 +13549,6 @@
         <w:pStyle w:val="SubSection"/>
       </w:pPr>
       <w:r>
-        <w:lastRenderedPageBreak/>
         <w:t>5.2.1</w:t>
       </w:r>
       <w:r>
@@ -13750,6 +13808,7 @@
           <w:ilvl w:val="0"/>
           <w:numId w:val="15"/>
         </w:numPr>
+        <w:spacing w:after="0"/>
         <w:ind w:right="-94"/>
       </w:pPr>
       <w:r>
@@ -13775,6 +13834,7 @@
           <w:ilvl w:val="0"/>
           <w:numId w:val="15"/>
         </w:numPr>
+        <w:spacing w:after="0"/>
         <w:ind w:right="-94"/>
       </w:pPr>
       <w:r>
@@ -13798,6 +13858,7 @@
           <w:ilvl w:val="0"/>
           <w:numId w:val="15"/>
         </w:numPr>
+        <w:spacing w:after="0"/>
         <w:ind w:right="-94"/>
       </w:pPr>
       <w:r>
@@ -13823,6 +13884,7 @@
           <w:ilvl w:val="0"/>
           <w:numId w:val="15"/>
         </w:numPr>
+        <w:spacing w:after="0"/>
         <w:ind w:right="-94"/>
       </w:pPr>
       <w:r>
@@ -13842,6 +13904,7 @@
           <w:ilvl w:val="0"/>
           <w:numId w:val="15"/>
         </w:numPr>
+        <w:spacing w:after="0"/>
         <w:ind w:right="-94"/>
       </w:pPr>
       <w:r>
@@ -13861,6 +13924,7 @@
           <w:ilvl w:val="0"/>
           <w:numId w:val="15"/>
         </w:numPr>
+        <w:spacing w:after="0"/>
         <w:ind w:right="-94"/>
       </w:pPr>
       <w:r>
@@ -13978,17 +14042,17 @@
         <w:t>Meridian</w:t>
       </w:r>
       <w:r>
-        <w:t xml:space="preserve">, and rpacfs1 — across Lambda, EC2, ECS, EKS, SQS, and supporting </w:t>
+        <w:t xml:space="preserve">, and rpacfs1 — across Lambda, EC2, ECS, EKS, SQS, and supporting AWS services. Implement a tag-based resource discovery pipeline using </w:t>
+      </w:r>
+      <w:r>
+        <w:t>budget_code</w:t>
+      </w:r>
+      <w:r>
+        <w:t xml:space="preserve"> as the </w:t>
       </w:r>
       <w:r>
         <w:lastRenderedPageBreak/>
-        <w:t xml:space="preserve">AWS services. Implement a tag-based resource discovery pipeline using </w:t>
-      </w:r>
-      <w:r>
-        <w:t>budget_code</w:t>
-      </w:r>
-      <w:r>
-        <w:t xml:space="preserve"> as the primary filter and AppName as the mandatory fallback discriminator for the </w:t>
+        <w:t xml:space="preserve">primary filter and AppName as the mandatory fallback discriminator for the </w:t>
       </w:r>
       <w:r>
         <w:t>Meridian</w:t>
@@ -14449,6 +14513,7 @@
           <w:ilvl w:val="0"/>
           <w:numId w:val="16"/>
         </w:numPr>
+        <w:spacing w:after="0"/>
         <w:ind w:right="-94"/>
       </w:pPr>
       <w:r>
@@ -14468,6 +14533,7 @@
           <w:ilvl w:val="0"/>
           <w:numId w:val="16"/>
         </w:numPr>
+        <w:spacing w:after="0"/>
         <w:ind w:right="-94"/>
       </w:pPr>
       <w:r>
@@ -14499,6 +14565,7 @@
           <w:ilvl w:val="0"/>
           <w:numId w:val="17"/>
         </w:numPr>
+        <w:spacing w:after="0"/>
         <w:ind w:right="-94"/>
       </w:pPr>
       <w:r>
@@ -14524,6 +14591,7 @@
           <w:ilvl w:val="0"/>
           <w:numId w:val="17"/>
         </w:numPr>
+        <w:spacing w:after="0"/>
         <w:ind w:right="-94"/>
       </w:pPr>
       <w:r>
@@ -14543,6 +14611,7 @@
           <w:ilvl w:val="0"/>
           <w:numId w:val="17"/>
         </w:numPr>
+        <w:spacing w:after="0"/>
         <w:ind w:right="-94"/>
       </w:pPr>
       <w:r>
@@ -14563,6 +14632,7 @@
           <w:ilvl w:val="0"/>
           <w:numId w:val="17"/>
         </w:numPr>
+        <w:spacing w:after="0"/>
         <w:ind w:right="-94"/>
       </w:pPr>
       <w:r>
@@ -14588,6 +14658,7 @@
           <w:ilvl w:val="0"/>
           <w:numId w:val="17"/>
         </w:numPr>
+        <w:spacing w:after="0"/>
         <w:ind w:right="-94"/>
       </w:pPr>
       <w:r>
@@ -14622,6 +14693,7 @@
         <w:tabs>
           <w:tab w:val="left" w:pos="567"/>
         </w:tabs>
+        <w:spacing w:after="0"/>
         <w:ind w:right="-94"/>
       </w:pPr>
       <w:r>
@@ -14650,6 +14722,7 @@
         <w:tabs>
           <w:tab w:val="left" w:pos="567"/>
         </w:tabs>
+        <w:spacing w:after="0"/>
         <w:ind w:right="-94"/>
       </w:pPr>
       <w:r>
@@ -14693,6 +14766,7 @@
         <w:tabs>
           <w:tab w:val="left" w:pos="567"/>
         </w:tabs>
+        <w:spacing w:after="0"/>
         <w:ind w:right="-94"/>
       </w:pPr>
       <w:r>
@@ -14727,6 +14801,7 @@
         <w:tabs>
           <w:tab w:val="left" w:pos="567"/>
         </w:tabs>
+        <w:spacing w:after="0"/>
         <w:ind w:right="-94"/>
       </w:pPr>
       <w:r>
@@ -14755,6 +14830,7 @@
         <w:tabs>
           <w:tab w:val="left" w:pos="567"/>
         </w:tabs>
+        <w:spacing w:after="0"/>
         <w:ind w:right="-94"/>
       </w:pPr>
       <w:r>
@@ -14789,6 +14865,7 @@
         <w:tabs>
           <w:tab w:val="left" w:pos="567"/>
         </w:tabs>
+        <w:spacing w:after="0"/>
         <w:ind w:right="-94"/>
       </w:pPr>
       <w:r>
@@ -14811,13 +14888,13 @@
         <w:tabs>
           <w:tab w:val="left" w:pos="567"/>
         </w:tabs>
+        <w:spacing w:after="0"/>
         <w:ind w:right="-94"/>
       </w:pPr>
       <w:r>
         <w:rPr>
           <w:b/>
         </w:rPr>
-        <w:lastRenderedPageBreak/>
         <w:t>Production stability</w:t>
       </w:r>
       <w:r>
@@ -14834,6 +14911,7 @@
         <w:tabs>
           <w:tab w:val="left" w:pos="567"/>
         </w:tabs>
+        <w:spacing w:after="0"/>
         <w:ind w:right="-94"/>
       </w:pPr>
       <w:r>
@@ -14851,6 +14929,7 @@
         <w:pStyle w:val="SubSection"/>
       </w:pPr>
       <w:r>
+        <w:lastRenderedPageBreak/>
         <w:t>6.3.6</w:t>
       </w:r>
       <w:r>
@@ -14868,6 +14947,7 @@
         <w:tabs>
           <w:tab w:val="left" w:pos="567"/>
         </w:tabs>
+        <w:spacing w:after="0"/>
         <w:ind w:right="-94"/>
       </w:pPr>
       <w:r>
@@ -14914,6 +14994,7 @@
         <w:tabs>
           <w:tab w:val="left" w:pos="567"/>
         </w:tabs>
+        <w:spacing w:after="0"/>
         <w:ind w:right="-94"/>
       </w:pPr>
       <w:r>
@@ -14936,6 +15017,7 @@
         <w:tabs>
           <w:tab w:val="left" w:pos="567"/>
         </w:tabs>
+        <w:spacing w:after="0"/>
         <w:ind w:right="-94"/>
       </w:pPr>
       <w:r>
@@ -15014,6 +15096,7 @@
           <w:ilvl w:val="0"/>
           <w:numId w:val="22"/>
         </w:numPr>
+        <w:spacing w:after="0"/>
         <w:ind w:right="-94"/>
       </w:pPr>
       <w:r>
@@ -15029,14 +15112,17 @@
         <w:t xml:space="preserve">CitcoWorks </w:t>
       </w:r>
       <w:r>
+        <w:t xml:space="preserve">Knowledge Graph), Amazon RDS Aurora (relational), Amazon ElastiCache for Redis and Valkey (in-memory caching — </w:t>
+      </w:r>
+      <w:r>
+        <w:t>Meridian</w:t>
+      </w:r>
+      <w:r>
+        <w:t xml:space="preserve"> ODL tier), and Amazon OpenSearch Service (search and analytics). Additional infrastructure covered includes Amazon ECR, AWS CodeCommit, </w:t>
+      </w:r>
+      <w:r>
         <w:lastRenderedPageBreak/>
-        <w:t xml:space="preserve">Knowledge Graph), Amazon RDS Aurora (relational), Amazon ElastiCache for Redis and Valkey (in-memory caching — </w:t>
-      </w:r>
-      <w:r>
-        <w:t>Meridian</w:t>
-      </w:r>
-      <w:r>
-        <w:t xml:space="preserve"> ODL tier), and Amazon OpenSearch Service (search and analytics). Additional infrastructure covered includes Amazon ECR, AWS CodeCommit, and the AWS IAM permission model (including cross-account role chaining for Grafana data source access).</w:t>
+        <w:t>and the AWS IAM permission model (including cross-account role chaining for Grafana data source access).</w:t>
       </w:r>
     </w:p>
     <w:p>
@@ -15046,6 +15132,7 @@
           <w:ilvl w:val="0"/>
           <w:numId w:val="22"/>
         </w:numPr>
+        <w:spacing w:after="0"/>
         <w:ind w:right="-94"/>
       </w:pPr>
       <w:r>
@@ -15071,6 +15158,7 @@
           <w:ilvl w:val="0"/>
           <w:numId w:val="22"/>
         </w:numPr>
+        <w:spacing w:after="0"/>
         <w:ind w:right="-94"/>
       </w:pPr>
       <w:r>
@@ -15090,6 +15178,7 @@
           <w:ilvl w:val="0"/>
           <w:numId w:val="22"/>
         </w:numPr>
+        <w:spacing w:after="0"/>
         <w:ind w:right="-94"/>
       </w:pPr>
       <w:r>
@@ -15109,13 +15198,13 @@
           <w:ilvl w:val="0"/>
           <w:numId w:val="22"/>
         </w:numPr>
+        <w:spacing w:after="0"/>
         <w:ind w:right="-94"/>
       </w:pPr>
       <w:r>
         <w:rPr>
           <w:b/>
         </w:rPr>
-        <w:lastRenderedPageBreak/>
         <w:t xml:space="preserve">Backend API Development. </w:t>
       </w:r>
       <w:r>
@@ -15129,6 +15218,7 @@
           <w:ilvl w:val="0"/>
           <w:numId w:val="22"/>
         </w:numPr>
+        <w:spacing w:after="0"/>
         <w:ind w:right="-94"/>
       </w:pPr>
       <w:r>
@@ -15138,7 +15228,11 @@
         <w:t xml:space="preserve">Software Engineering Practices. </w:t>
       </w:r>
       <w:r>
-        <w:t>Practice spec-driven development via the Kiro IDE workflow (.kiro/specs/ with requirements.md, design.md, tasks.md), and apply AI-augmented engineering using Kiro (Claude Sonnet) and Amazon Q to accelerate design documentation, code scaffolding, and test generation.</w:t>
+        <w:t>Practice spec-driven development via the Kiro IDE workflow (.kiro/specs/ with requirements.md, design.md, tasks.md), and apply AI-</w:t>
+      </w:r>
+      <w:r>
+        <w:lastRenderedPageBreak/>
+        <w:t>augmented engineering using Kiro (Claude Sonnet) and Amazon Q to accelerate design documentation, code scaffolding, and test generation.</w:t>
       </w:r>
     </w:p>
     <w:p>
@@ -15148,6 +15242,7 @@
           <w:ilvl w:val="0"/>
           <w:numId w:val="22"/>
         </w:numPr>
+        <w:spacing w:after="0"/>
         <w:ind w:right="-94"/>
       </w:pPr>
       <w:r>
@@ -15182,6 +15277,7 @@
           <w:ilvl w:val="0"/>
           <w:numId w:val="23"/>
         </w:numPr>
+        <w:spacing w:after="0"/>
         <w:ind w:right="-94"/>
       </w:pPr>
       <w:r>
@@ -15207,6 +15303,7 @@
           <w:ilvl w:val="0"/>
           <w:numId w:val="23"/>
         </w:numPr>
+        <w:spacing w:after="0"/>
         <w:ind w:right="-94"/>
       </w:pPr>
       <w:r>
@@ -15316,6 +15413,7 @@
           <w:ilvl w:val="0"/>
           <w:numId w:val="23"/>
         </w:numPr>
+        <w:spacing w:after="0"/>
         <w:ind w:right="-94"/>
       </w:pPr>
       <w:r>
@@ -15335,17 +15433,25 @@
           <w:ilvl w:val="0"/>
           <w:numId w:val="23"/>
         </w:numPr>
+        <w:spacing w:after="0"/>
         <w:ind w:right="-94"/>
       </w:pPr>
       <w:r>
         <w:rPr>
           <w:b/>
         </w:rPr>
-        <w:lastRenderedPageBreak/>
         <w:t xml:space="preserve">Technical Communication and Documentation. </w:t>
       </w:r>
       <w:r>
-        <w:t>Produce engineering-grade written deliverables: incident RCA reports, architecture design documents, Confluence knowledge-base pages, runbooks, and this academic report.</w:t>
+        <w:t>Produce engineering-grade written deliverables: incident RCA reports, architecture design documents, Confluence knowledge-</w:t>
+      </w:r>
+      <w:proofErr w:type="spellStart"/>
+      <w:r>
+        <w:t>base</w:t>
+      </w:r>
+      <w:proofErr w:type="spellEnd"/>
+      <w:r>
+        <w:t xml:space="preserve"> pages, runbooks, and this academic report.</w:t>
       </w:r>
     </w:p>
     <w:p>
@@ -15355,6 +15461,7 @@
           <w:ilvl w:val="0"/>
           <w:numId w:val="23"/>
         </w:numPr>
+        <w:spacing w:after="0"/>
         <w:ind w:right="-94"/>
       </w:pPr>
       <w:r>
@@ -15373,6 +15480,7 @@
       </w:pPr>
       <w:bookmarkStart w:id="36" w:name="_Toc241456003"/>
       <w:r>
+        <w:lastRenderedPageBreak/>
         <w:t>8.</w:t>
       </w:r>
       <w:r>
@@ -15484,8 +15592,8 @@
       </w:tblPr>
       <w:tblGrid>
         <w:gridCol w:w="1985"/>
-        <w:gridCol w:w="2409"/>
-        <w:gridCol w:w="5010"/>
+        <w:gridCol w:w="2693"/>
+        <w:gridCol w:w="4726"/>
       </w:tblGrid>
       <w:tr>
         <w:trPr>
@@ -15523,7 +15631,7 @@
         </w:tc>
         <w:tc>
           <w:tcPr>
-            <w:tcW w:w="1281" w:type="pct"/>
+            <w:tcW w:w="1432" w:type="pct"/>
             <w:tcBorders>
               <w:top w:val="none" w:sz="0" w:space="0" w:color="auto"/>
               <w:bottom w:val="none" w:sz="0" w:space="0" w:color="auto"/>
@@ -15553,7 +15661,7 @@
         </w:tc>
         <w:tc>
           <w:tcPr>
-            <w:tcW w:w="2663" w:type="pct"/>
+            <w:tcW w:w="2513" w:type="pct"/>
             <w:tcBorders>
               <w:top w:val="none" w:sz="0" w:space="0" w:color="auto"/>
               <w:bottom w:val="none" w:sz="0" w:space="0" w:color="auto"/>
@@ -15612,7 +15720,7 @@
         </w:tc>
         <w:tc>
           <w:tcPr>
-            <w:tcW w:w="1281" w:type="pct"/>
+            <w:tcW w:w="1432" w:type="pct"/>
           </w:tcPr>
           <w:p>
             <w:pPr>
@@ -15636,7 +15744,7 @@
         </w:tc>
         <w:tc>
           <w:tcPr>
-            <w:tcW w:w="2663" w:type="pct"/>
+            <w:tcW w:w="2513" w:type="pct"/>
           </w:tcPr>
           <w:p>
             <w:pPr>
@@ -15689,7 +15797,7 @@
         </w:tc>
         <w:tc>
           <w:tcPr>
-            <w:tcW w:w="1281" w:type="pct"/>
+            <w:tcW w:w="1432" w:type="pct"/>
           </w:tcPr>
           <w:p>
             <w:pPr>
@@ -15713,7 +15821,7 @@
         </w:tc>
         <w:tc>
           <w:tcPr>
-            <w:tcW w:w="2663" w:type="pct"/>
+            <w:tcW w:w="2513" w:type="pct"/>
           </w:tcPr>
           <w:p>
             <w:pPr>
@@ -15766,7 +15874,7 @@
         </w:tc>
         <w:tc>
           <w:tcPr>
-            <w:tcW w:w="1281" w:type="pct"/>
+            <w:tcW w:w="1432" w:type="pct"/>
           </w:tcPr>
           <w:p>
             <w:pPr>
@@ -15790,7 +15898,7 @@
         </w:tc>
         <w:tc>
           <w:tcPr>
-            <w:tcW w:w="2663" w:type="pct"/>
+            <w:tcW w:w="2513" w:type="pct"/>
           </w:tcPr>
           <w:p>
             <w:pPr>
@@ -15843,7 +15951,7 @@
         </w:tc>
         <w:tc>
           <w:tcPr>
-            <w:tcW w:w="1281" w:type="pct"/>
+            <w:tcW w:w="1432" w:type="pct"/>
           </w:tcPr>
           <w:p>
             <w:pPr>
@@ -15867,7 +15975,7 @@
         </w:tc>
         <w:tc>
           <w:tcPr>
-            <w:tcW w:w="2663" w:type="pct"/>
+            <w:tcW w:w="2513" w:type="pct"/>
           </w:tcPr>
           <w:p>
             <w:pPr>
@@ -15927,7 +16035,7 @@
         </w:tc>
         <w:tc>
           <w:tcPr>
-            <w:tcW w:w="1281" w:type="pct"/>
+            <w:tcW w:w="1432" w:type="pct"/>
           </w:tcPr>
           <w:p>
             <w:pPr>
@@ -15951,7 +16059,7 @@
         </w:tc>
         <w:tc>
           <w:tcPr>
-            <w:tcW w:w="2663" w:type="pct"/>
+            <w:tcW w:w="2513" w:type="pct"/>
           </w:tcPr>
           <w:p>
             <w:pPr>
@@ -16004,7 +16112,7 @@
         </w:tc>
         <w:tc>
           <w:tcPr>
-            <w:tcW w:w="1281" w:type="pct"/>
+            <w:tcW w:w="1432" w:type="pct"/>
           </w:tcPr>
           <w:p>
             <w:pPr>
@@ -16028,7 +16136,7 @@
         </w:tc>
         <w:tc>
           <w:tcPr>
-            <w:tcW w:w="2663" w:type="pct"/>
+            <w:tcW w:w="2513" w:type="pct"/>
           </w:tcPr>
           <w:p>
             <w:pPr>
@@ -16059,7 +16167,6 @@
       </w:pPr>
       <w:bookmarkStart w:id="41" w:name="_Toc241456005"/>
       <w:r>
-        <w:lastRenderedPageBreak/>
         <w:t>8.2</w:t>
       </w:r>
       <w:r>
@@ -16073,6 +16180,7 @@
         <w:tabs>
           <w:tab w:val="left" w:pos="567"/>
         </w:tabs>
+        <w:spacing w:after="0"/>
         <w:ind w:right="-94"/>
       </w:pPr>
       <w:r>
@@ -16081,9 +16189,23 @@
     </w:p>
     <w:p>
       <w:pPr>
+        <w:spacing w:line="278" w:lineRule="auto"/>
+        <w:jc w:val="left"/>
+        <w:rPr>
+          <w:b/>
+          <w:color w:val="8A0027"/>
+        </w:rPr>
+      </w:pPr>
+      <w:r>
+        <w:br w:type="page"/>
+      </w:r>
+    </w:p>
+    <w:p>
+      <w:pPr>
         <w:pStyle w:val="SubSection"/>
       </w:pPr>
       <w:r>
+        <w:lastRenderedPageBreak/>
         <w:t>8.2.1</w:t>
       </w:r>
       <w:r>
@@ -16273,27 +16395,37 @@
         <w:t xml:space="preserve">JIRA Story Refinement. </w:t>
       </w:r>
       <w:r>
-        <w:t xml:space="preserve">The dashboard project went through multiple refinement cycles between May 6 and May 11 (infrastructure deployment date). These sessions with Mr. Deotale and Ms. Labos surfaced the infrastructure-as-code requirement (FR7), the multi-environment reuse requirement (NFR5), and the credential management constraint (NFR7). The elevation of the </w:t>
-      </w:r>
+        <w:t xml:space="preserve">The dashboard project went through multiple refinement cycles between May 6 and May 11 (infrastructure deployment date). These sessions with Mr. Deotale and Ms. Labos surfaced the infrastructure-as-code requirement (FR7), the multi-environment reuse requirement (NFR5), and the credential management constraint (NFR7). The elevation of the dashboard to Critical priority on May 6 also functionally set NFR1 (dashboard refresh latency </w:t>
+      </w:r>
+      <w:r>
+        <w:rPr>
+          <w:rFonts w:eastAsia="Cambria"/>
+        </w:rPr>
+        <w:t>≤</w:t>
+      </w:r>
+      <w:r>
+        <w:t>30 seconds) as a hard constraint rather than an aspirational target.</w:t>
+      </w:r>
+    </w:p>
+    <w:p>
+      <w:pPr>
+        <w:spacing w:line="278" w:lineRule="auto"/>
+        <w:jc w:val="left"/>
+        <w:rPr>
+          <w:b/>
+          <w:color w:val="8A0027"/>
+        </w:rPr>
+      </w:pPr>
+      <w:r>
+        <w:br w:type="page"/>
+      </w:r>
+    </w:p>
+    <w:p>
+      <w:pPr>
+        <w:pStyle w:val="SubSection"/>
+      </w:pPr>
       <w:r>
         <w:lastRenderedPageBreak/>
-        <w:t xml:space="preserve">dashboard to Critical priority on May 6 also functionally set NFR1 (dashboard refresh latency </w:t>
-      </w:r>
-      <w:r>
-        <w:rPr>
-          <w:rFonts w:eastAsia="Cambria"/>
-        </w:rPr>
-        <w:t>≤</w:t>
-      </w:r>
-      <w:r>
-        <w:t>30 seconds) as a hard constraint rather than an aspirational target.</w:t>
-      </w:r>
-    </w:p>
-    <w:p>
-      <w:pPr>
-        <w:pStyle w:val="SubSection"/>
-      </w:pPr>
-      <w:r>
         <w:t>8.2.2</w:t>
       </w:r>
       <w:r>
@@ -16459,6 +16591,7 @@
         <w:tabs>
           <w:tab w:val="left" w:pos="567"/>
         </w:tabs>
+        <w:spacing w:after="0"/>
         <w:ind w:right="-94"/>
       </w:pPr>
       <w:r>
@@ -16520,9 +16653,9 @@
         <w:tblLook w:val="04A0" w:firstRow="1" w:lastRow="0" w:firstColumn="1" w:lastColumn="0" w:noHBand="0" w:noVBand="1"/>
       </w:tblPr>
       <w:tblGrid>
-        <w:gridCol w:w="709"/>
-        <w:gridCol w:w="5246"/>
-        <w:gridCol w:w="3449"/>
+        <w:gridCol w:w="710"/>
+        <w:gridCol w:w="4820"/>
+        <w:gridCol w:w="3874"/>
       </w:tblGrid>
       <w:tr>
         <w:trPr>
@@ -16559,7 +16692,7 @@
         </w:tc>
         <w:tc>
           <w:tcPr>
-            <w:tcW w:w="2789" w:type="pct"/>
+            <w:tcW w:w="2563" w:type="pct"/>
             <w:tcBorders>
               <w:top w:val="none" w:sz="0" w:space="0" w:color="auto"/>
               <w:bottom w:val="none" w:sz="0" w:space="0" w:color="auto"/>
@@ -16588,7 +16721,7 @@
         </w:tc>
         <w:tc>
           <w:tcPr>
-            <w:tcW w:w="1834" w:type="pct"/>
+            <w:tcW w:w="2060" w:type="pct"/>
             <w:tcBorders>
               <w:top w:val="none" w:sz="0" w:space="0" w:color="auto"/>
               <w:bottom w:val="none" w:sz="0" w:space="0" w:color="auto"/>
@@ -16640,14 +16773,13 @@
                 <w:sz w:val="24"/>
                 <w:szCs w:val="24"/>
               </w:rPr>
-              <w:lastRenderedPageBreak/>
               <w:t>FR1</w:t>
             </w:r>
           </w:p>
         </w:tc>
         <w:tc>
           <w:tcPr>
-            <w:tcW w:w="2789" w:type="pct"/>
+            <w:tcW w:w="2563" w:type="pct"/>
           </w:tcPr>
           <w:p>
             <w:pPr>
@@ -16671,7 +16803,7 @@
         </w:tc>
         <w:tc>
           <w:tcPr>
-            <w:tcW w:w="1834" w:type="pct"/>
+            <w:tcW w:w="2060" w:type="pct"/>
           </w:tcPr>
           <w:p>
             <w:pPr>
@@ -16718,13 +16850,14 @@
                 <w:sz w:val="24"/>
                 <w:szCs w:val="24"/>
               </w:rPr>
+              <w:lastRenderedPageBreak/>
               <w:t>FR2</w:t>
             </w:r>
           </w:p>
         </w:tc>
         <w:tc>
           <w:tcPr>
-            <w:tcW w:w="2789" w:type="pct"/>
+            <w:tcW w:w="2563" w:type="pct"/>
           </w:tcPr>
           <w:p>
             <w:pPr>
@@ -16748,7 +16881,7 @@
         </w:tc>
         <w:tc>
           <w:tcPr>
-            <w:tcW w:w="1834" w:type="pct"/>
+            <w:tcW w:w="2060" w:type="pct"/>
           </w:tcPr>
           <w:p>
             <w:pPr>
@@ -16801,7 +16934,7 @@
         </w:tc>
         <w:tc>
           <w:tcPr>
-            <w:tcW w:w="2789" w:type="pct"/>
+            <w:tcW w:w="2563" w:type="pct"/>
           </w:tcPr>
           <w:p>
             <w:pPr>
@@ -16825,7 +16958,7 @@
         </w:tc>
         <w:tc>
           <w:tcPr>
-            <w:tcW w:w="1834" w:type="pct"/>
+            <w:tcW w:w="2060" w:type="pct"/>
           </w:tcPr>
           <w:p>
             <w:pPr>
@@ -16878,7 +17011,7 @@
         </w:tc>
         <w:tc>
           <w:tcPr>
-            <w:tcW w:w="2789" w:type="pct"/>
+            <w:tcW w:w="2563" w:type="pct"/>
           </w:tcPr>
           <w:p>
             <w:pPr>
@@ -16902,7 +17035,7 @@
         </w:tc>
         <w:tc>
           <w:tcPr>
-            <w:tcW w:w="1834" w:type="pct"/>
+            <w:tcW w:w="2060" w:type="pct"/>
           </w:tcPr>
           <w:p>
             <w:pPr>
@@ -16955,7 +17088,7 @@
         </w:tc>
         <w:tc>
           <w:tcPr>
-            <w:tcW w:w="2789" w:type="pct"/>
+            <w:tcW w:w="2563" w:type="pct"/>
           </w:tcPr>
           <w:p>
             <w:pPr>
@@ -16979,7 +17112,7 @@
         </w:tc>
         <w:tc>
           <w:tcPr>
-            <w:tcW w:w="1834" w:type="pct"/>
+            <w:tcW w:w="2060" w:type="pct"/>
           </w:tcPr>
           <w:p>
             <w:pPr>
@@ -17032,7 +17165,7 @@
         </w:tc>
         <w:tc>
           <w:tcPr>
-            <w:tcW w:w="2789" w:type="pct"/>
+            <w:tcW w:w="2563" w:type="pct"/>
           </w:tcPr>
           <w:p>
             <w:pPr>
@@ -17056,7 +17189,7 @@
         </w:tc>
         <w:tc>
           <w:tcPr>
-            <w:tcW w:w="1834" w:type="pct"/>
+            <w:tcW w:w="2060" w:type="pct"/>
           </w:tcPr>
           <w:p>
             <w:pPr>
@@ -17109,7 +17242,7 @@
         </w:tc>
         <w:tc>
           <w:tcPr>
-            <w:tcW w:w="2789" w:type="pct"/>
+            <w:tcW w:w="2563" w:type="pct"/>
           </w:tcPr>
           <w:p>
             <w:pPr>
@@ -17133,7 +17266,7 @@
         </w:tc>
         <w:tc>
           <w:tcPr>
-            <w:tcW w:w="1834" w:type="pct"/>
+            <w:tcW w:w="2060" w:type="pct"/>
           </w:tcPr>
           <w:p>
             <w:pPr>
@@ -17186,7 +17319,7 @@
         </w:tc>
         <w:tc>
           <w:tcPr>
-            <w:tcW w:w="2789" w:type="pct"/>
+            <w:tcW w:w="2563" w:type="pct"/>
           </w:tcPr>
           <w:p>
             <w:pPr>
@@ -17210,7 +17343,7 @@
         </w:tc>
         <w:tc>
           <w:tcPr>
-            <w:tcW w:w="1834" w:type="pct"/>
+            <w:tcW w:w="2060" w:type="pct"/>
           </w:tcPr>
           <w:p>
             <w:pPr>
@@ -17263,7 +17396,7 @@
         </w:tc>
         <w:tc>
           <w:tcPr>
-            <w:tcW w:w="2789" w:type="pct"/>
+            <w:tcW w:w="2563" w:type="pct"/>
           </w:tcPr>
           <w:p>
             <w:pPr>
@@ -17308,7 +17441,7 @@
         </w:tc>
         <w:tc>
           <w:tcPr>
-            <w:tcW w:w="1834" w:type="pct"/>
+            <w:tcW w:w="2060" w:type="pct"/>
           </w:tcPr>
           <w:p>
             <w:pPr>
@@ -17452,10 +17585,10 @@
         <w:tblLook w:val="04A0" w:firstRow="1" w:lastRow="0" w:firstColumn="1" w:lastColumn="0" w:noHBand="0" w:noVBand="1"/>
       </w:tblPr>
       <w:tblGrid>
-        <w:gridCol w:w="994"/>
-        <w:gridCol w:w="4536"/>
-        <w:gridCol w:w="1984"/>
-        <w:gridCol w:w="1890"/>
+        <w:gridCol w:w="993"/>
+        <w:gridCol w:w="4110"/>
+        <w:gridCol w:w="2268"/>
+        <w:gridCol w:w="2033"/>
       </w:tblGrid>
       <w:tr>
         <w:trPr>
@@ -17492,7 +17625,7 @@
         </w:tc>
         <w:tc>
           <w:tcPr>
-            <w:tcW w:w="2412" w:type="pct"/>
+            <w:tcW w:w="2185" w:type="pct"/>
             <w:tcBorders>
               <w:top w:val="none" w:sz="0" w:space="0" w:color="auto"/>
               <w:bottom w:val="none" w:sz="0" w:space="0" w:color="auto"/>
@@ -17521,7 +17654,7 @@
         </w:tc>
         <w:tc>
           <w:tcPr>
-            <w:tcW w:w="1055" w:type="pct"/>
+            <w:tcW w:w="1206" w:type="pct"/>
             <w:tcBorders>
               <w:top w:val="none" w:sz="0" w:space="0" w:color="auto"/>
               <w:bottom w:val="none" w:sz="0" w:space="0" w:color="auto"/>
@@ -17550,7 +17683,7 @@
         </w:tc>
         <w:tc>
           <w:tcPr>
-            <w:tcW w:w="1005" w:type="pct"/>
+            <w:tcW w:w="1081" w:type="pct"/>
             <w:tcBorders>
               <w:top w:val="none" w:sz="0" w:space="0" w:color="auto"/>
               <w:bottom w:val="none" w:sz="0" w:space="0" w:color="auto"/>
@@ -17608,7 +17741,7 @@
         </w:tc>
         <w:tc>
           <w:tcPr>
-            <w:tcW w:w="2412" w:type="pct"/>
+            <w:tcW w:w="2185" w:type="pct"/>
           </w:tcPr>
           <w:p>
             <w:pPr>
@@ -17632,7 +17765,7 @@
         </w:tc>
         <w:tc>
           <w:tcPr>
-            <w:tcW w:w="1055" w:type="pct"/>
+            <w:tcW w:w="1206" w:type="pct"/>
           </w:tcPr>
           <w:p>
             <w:pPr>
@@ -17656,7 +17789,7 @@
         </w:tc>
         <w:tc>
           <w:tcPr>
-            <w:tcW w:w="1005" w:type="pct"/>
+            <w:tcW w:w="1081" w:type="pct"/>
           </w:tcPr>
           <w:p>
             <w:pPr>
@@ -17703,14 +17836,13 @@
                 <w:sz w:val="24"/>
                 <w:szCs w:val="24"/>
               </w:rPr>
-              <w:lastRenderedPageBreak/>
               <w:t>NFR2</w:t>
             </w:r>
           </w:p>
         </w:tc>
         <w:tc>
           <w:tcPr>
-            <w:tcW w:w="2412" w:type="pct"/>
+            <w:tcW w:w="2185" w:type="pct"/>
           </w:tcPr>
           <w:p>
             <w:pPr>
@@ -17734,7 +17866,7 @@
         </w:tc>
         <w:tc>
           <w:tcPr>
-            <w:tcW w:w="1055" w:type="pct"/>
+            <w:tcW w:w="1206" w:type="pct"/>
           </w:tcPr>
           <w:p>
             <w:pPr>
@@ -17758,7 +17890,7 @@
         </w:tc>
         <w:tc>
           <w:tcPr>
-            <w:tcW w:w="1005" w:type="pct"/>
+            <w:tcW w:w="1081" w:type="pct"/>
           </w:tcPr>
           <w:p>
             <w:pPr>
@@ -17805,13 +17937,14 @@
                 <w:sz w:val="24"/>
                 <w:szCs w:val="24"/>
               </w:rPr>
+              <w:lastRenderedPageBreak/>
               <w:t>NFR3</w:t>
             </w:r>
           </w:p>
         </w:tc>
         <w:tc>
           <w:tcPr>
-            <w:tcW w:w="2412" w:type="pct"/>
+            <w:tcW w:w="2185" w:type="pct"/>
           </w:tcPr>
           <w:p>
             <w:pPr>
@@ -17835,7 +17968,7 @@
         </w:tc>
         <w:tc>
           <w:tcPr>
-            <w:tcW w:w="1055" w:type="pct"/>
+            <w:tcW w:w="1206" w:type="pct"/>
           </w:tcPr>
           <w:p>
             <w:pPr>
@@ -17859,7 +17992,7 @@
         </w:tc>
         <w:tc>
           <w:tcPr>
-            <w:tcW w:w="1005" w:type="pct"/>
+            <w:tcW w:w="1081" w:type="pct"/>
           </w:tcPr>
           <w:p>
             <w:pPr>
@@ -17912,7 +18045,7 @@
         </w:tc>
         <w:tc>
           <w:tcPr>
-            <w:tcW w:w="2412" w:type="pct"/>
+            <w:tcW w:w="2185" w:type="pct"/>
           </w:tcPr>
           <w:p>
             <w:pPr>
@@ -17936,7 +18069,7 @@
         </w:tc>
         <w:tc>
           <w:tcPr>
-            <w:tcW w:w="1055" w:type="pct"/>
+            <w:tcW w:w="1206" w:type="pct"/>
           </w:tcPr>
           <w:p>
             <w:pPr>
@@ -17960,7 +18093,7 @@
         </w:tc>
         <w:tc>
           <w:tcPr>
-            <w:tcW w:w="1005" w:type="pct"/>
+            <w:tcW w:w="1081" w:type="pct"/>
           </w:tcPr>
           <w:p>
             <w:pPr>
@@ -18013,7 +18146,7 @@
         </w:tc>
         <w:tc>
           <w:tcPr>
-            <w:tcW w:w="2412" w:type="pct"/>
+            <w:tcW w:w="2185" w:type="pct"/>
           </w:tcPr>
           <w:p>
             <w:pPr>
@@ -18037,7 +18170,7 @@
         </w:tc>
         <w:tc>
           <w:tcPr>
-            <w:tcW w:w="1055" w:type="pct"/>
+            <w:tcW w:w="1206" w:type="pct"/>
           </w:tcPr>
           <w:p>
             <w:pPr>
@@ -18061,7 +18194,7 @@
         </w:tc>
         <w:tc>
           <w:tcPr>
-            <w:tcW w:w="1005" w:type="pct"/>
+            <w:tcW w:w="1081" w:type="pct"/>
           </w:tcPr>
           <w:p>
             <w:pPr>
@@ -18114,7 +18247,7 @@
         </w:tc>
         <w:tc>
           <w:tcPr>
-            <w:tcW w:w="2412" w:type="pct"/>
+            <w:tcW w:w="2185" w:type="pct"/>
           </w:tcPr>
           <w:p>
             <w:pPr>
@@ -18138,7 +18271,7 @@
         </w:tc>
         <w:tc>
           <w:tcPr>
-            <w:tcW w:w="1055" w:type="pct"/>
+            <w:tcW w:w="1206" w:type="pct"/>
           </w:tcPr>
           <w:p>
             <w:pPr>
@@ -18162,7 +18295,7 @@
         </w:tc>
         <w:tc>
           <w:tcPr>
-            <w:tcW w:w="1005" w:type="pct"/>
+            <w:tcW w:w="1081" w:type="pct"/>
           </w:tcPr>
           <w:p>
             <w:pPr>
@@ -18215,7 +18348,7 @@
         </w:tc>
         <w:tc>
           <w:tcPr>
-            <w:tcW w:w="2412" w:type="pct"/>
+            <w:tcW w:w="2185" w:type="pct"/>
           </w:tcPr>
           <w:p>
             <w:pPr>
@@ -18239,7 +18372,7 @@
         </w:tc>
         <w:tc>
           <w:tcPr>
-            <w:tcW w:w="1055" w:type="pct"/>
+            <w:tcW w:w="1206" w:type="pct"/>
           </w:tcPr>
           <w:p>
             <w:pPr>
@@ -18263,7 +18396,7 @@
         </w:tc>
         <w:tc>
           <w:tcPr>
-            <w:tcW w:w="1005" w:type="pct"/>
+            <w:tcW w:w="1081" w:type="pct"/>
           </w:tcPr>
           <w:p>
             <w:pPr>
@@ -18367,11 +18500,11 @@
         <w:ind w:right="-94"/>
       </w:pPr>
       <w:r>
-        <w:t xml:space="preserve">NFR7 received an unexpected real-world validation during the CAIS Deadline hotfix on June 8, 2026. The incident revealed that the ECS container’s credential loading pattern (reading from </w:t>
+        <w:t xml:space="preserve">NFR7 received an unexpected real-world validation during the CAIS Deadline hotfix on June 8, 2026. The incident revealed that the ECS container’s credential loading pattern (reading from Secrets Manager once at module import time via constants.py) was fragile under secret rotation. </w:t>
       </w:r>
       <w:r>
         <w:lastRenderedPageBreak/>
-        <w:t>Secrets Manager once at module import time via constants.py) was fragile under secret rotation. The hotfix I delivered introduced fail-fast credential validation — a design improvement that reinforced NFR7 by ensuring that absent or expired credentials from Secrets Manager produce an immediate, visible failure rather than a silent downstream authentication error.</w:t>
+        <w:t>The hotfix I delivered introduced fail-fast credential validation — a design improvement that reinforced NFR7 by ensuring that absent or expired credentials from Secrets Manager produce an immediate, visible failure rather than a silent downstream authentication error.</w:t>
       </w:r>
     </w:p>
     <w:p>
@@ -18456,10 +18589,26 @@
     </w:p>
     <w:p>
       <w:pPr>
+        <w:spacing w:line="278" w:lineRule="auto"/>
+        <w:jc w:val="left"/>
+        <w:rPr>
+          <w:b/>
+          <w:color w:val="8A0027"/>
+          <w:sz w:val="32"/>
+          <w:szCs w:val="28"/>
+        </w:rPr>
+      </w:pPr>
+      <w:bookmarkStart w:id="49" w:name="_Toc241456007"/>
+      <w:r>
+        <w:br w:type="page"/>
+      </w:r>
+    </w:p>
+    <w:p>
+      <w:pPr>
         <w:pStyle w:val="Chapter"/>
       </w:pPr>
-      <w:bookmarkStart w:id="49" w:name="_Toc241456007"/>
-      <w:r>
+      <w:r>
+        <w:lastRenderedPageBreak/>
         <w:t>9. METHODOLOGIES</w:t>
       </w:r>
       <w:bookmarkEnd w:id="49"/>
@@ -18478,11 +18627,7 @@
         <w:t>Meridian</w:t>
       </w:r>
       <w:r>
-        <w:t xml:space="preserve"> Incident. This chapter covers three </w:t>
-      </w:r>
-      <w:r>
-        <w:lastRenderedPageBreak/>
-        <w:t>areas: the SRE principles I applied, the gap analysis that established the starting posture, and the Dynatrace parity evaluation that framed the research question.</w:t>
+        <w:t xml:space="preserve"> Incident. This chapter covers three areas: the SRE principles I applied, the gap analysis that established the starting posture, and the Dynatrace parity evaluation that framed the research question.</w:t>
       </w:r>
     </w:p>
     <w:p>
@@ -18663,7 +18808,11 @@
         <w:t>Meridian</w:t>
       </w:r>
       <w:r>
-        <w:t xml:space="preserve"> incident. It is measured as Lambda concurrent execution count relative to the account concurrency limit, ECS task CPU and memory utilization, MSK consumer lag (the number of messages awaiting processing on a Kafka topic), and SQS queue depth with oldest-message age. A service approaching saturation degrades before it fails — making this the most actionable of the four signals.</w:t>
+        <w:t xml:space="preserve"> incident. It is measured as Lambda concurrent execution count relative to the account concurrency limit, ECS task CPU and memory utilization, MSK consumer lag </w:t>
+      </w:r>
+      <w:r>
+        <w:lastRenderedPageBreak/>
+        <w:t>(the number of messages awaiting processing on a Kafka topic), and SQS queue depth with oldest-message age. A service approaching saturation degrades before it fails — making this the most actionable of the four signals.</w:t>
       </w:r>
     </w:p>
     <w:p>
@@ -18674,7 +18823,6 @@
         <w:ind w:right="-94"/>
       </w:pPr>
       <w:r>
-        <w:lastRenderedPageBreak/>
         <w:fldChar w:fldCharType="begin"/>
       </w:r>
       <w:r>
@@ -18879,7 +19027,11 @@
         <w:t xml:space="preserve">10,000 messages </w:t>
       </w:r>
       <w:r>
-        <w:t>at any point. Derived from the April 17 post-mortem: lag reached 9 million messages before detection; a 10,000-message threshold would have fired within minutes of onset.</w:t>
+        <w:t xml:space="preserve">at any point. Derived from the April </w:t>
+      </w:r>
+      <w:r>
+        <w:lastRenderedPageBreak/>
+        <w:t>17 post-mortem: lag reached 9 million messages before detection; a 10,000-message threshold would have fired within minutes of onset.</w:t>
       </w:r>
     </w:p>
     <w:p>
@@ -18895,7 +19047,6 @@
         <w:rPr>
           <w:b/>
         </w:rPr>
-        <w:lastRenderedPageBreak/>
         <w:t>ECS CPU utilization</w:t>
       </w:r>
       <w:r>
@@ -19054,6 +19205,7 @@
         <w:rPr>
           <w:b/>
         </w:rPr>
+        <w:lastRenderedPageBreak/>
         <w:t xml:space="preserve">No CloudWatch alarms on any </w:t>
       </w:r>
       <w:r>
@@ -19075,11 +19227,7 @@
         <w:t>Meridian</w:t>
       </w:r>
       <w:r>
-        <w:t xml:space="preserve"> Kafka-backed event pipeline — the most business-critical component of the IA platform — had zero proactive alerting. </w:t>
-      </w:r>
-      <w:r>
-        <w:lastRenderedPageBreak/>
-        <w:t xml:space="preserve">No alarms existed on MSK consumer lag, ECS task failure counts, Lambda error rates, or SQS queue depth for any </w:t>
+        <w:t xml:space="preserve"> Kafka-backed event pipeline — the most business-critical component of the IA platform — had zero proactive alerting. No alarms existed on MSK consumer lag, ECS task failure counts, Lambda error rates, or SQS queue depth for any </w:t>
       </w:r>
       <w:r>
         <w:t>Meridian</w:t>
@@ -19319,7 +19467,11 @@
         <w:t xml:space="preserve"> </w:t>
       </w:r>
       <w:r>
-        <w:t>monitored exclusively through their respective orchestrator platforms (Blue Prism Orchestrator and UiPath Cloud). No CloudWatch integration existed, and there was no mechanism for the SRE team to receive proactive notification of bot failures or queue backlogs outside the orchestrator UI.</w:t>
+        <w:t xml:space="preserve">monitored exclusively through their respective orchestrator platforms (Blue Prism Orchestrator and UiPath Cloud). No CloudWatch integration existed, and there was no </w:t>
+      </w:r>
+      <w:r>
+        <w:lastRenderedPageBreak/>
+        <w:t>mechanism for the SRE team to receive proactive notification of bot failures or queue backlogs outside the orchestrator UI.</w:t>
       </w:r>
     </w:p>
     <w:p>
@@ -19335,7 +19487,6 @@
         <w:rPr>
           <w:b/>
         </w:rPr>
-        <w:lastRenderedPageBreak/>
         <w:t xml:space="preserve">Reactive operational posture. </w:t>
       </w:r>
       <w:r>
@@ -20356,6 +20507,7 @@
       <w:bookmarkStart w:id="60" w:name="_Ref240868762"/>
       <w:bookmarkStart w:id="61" w:name="_Toc240883141"/>
       <w:r>
+        <w:lastRenderedPageBreak/>
         <w:t xml:space="preserve">Table </w:t>
       </w:r>
       <w:fldSimple w:instr=" SEQ Table \* ARABIC ">
@@ -20747,7 +20899,6 @@
                 <w:sz w:val="24"/>
                 <w:szCs w:val="24"/>
               </w:rPr>
-              <w:lastRenderedPageBreak/>
               <w:t>Infrastructure Metrics</w:t>
             </w:r>
           </w:p>
@@ -22852,7 +23003,11 @@
         <w:t xml:space="preserve">consumers layer </w:t>
       </w:r>
       <w:r>
-        <w:t>includes three groups: operators who use the Grafana dashboard I built during incident response, the IA Resources Inventory REST API I developed that exposes the AWS service fleet programmatically, and the SRE team’s email distribution list that receives SNS alarm notifications I configured. This layered architecture ensures separation of concerns: the data layer handles metric collection and storage, the visualization layer transforms raw metrics into actionable insights, and the consumer layer delivers those insights to the appropriate stakeholders through purpose-built interfaces.</w:t>
+        <w:t xml:space="preserve">includes three groups: operators who use the Grafana dashboard I built during incident response, the IA Resources Inventory REST API I developed that exposes the AWS service fleet programmatically, and the SRE team’s email distribution list that receives SNS alarm notifications I configured. This layered architecture ensures separation of concerns: the data layer handles metric collection and storage, the visualization layer transforms raw metrics into </w:t>
+      </w:r>
+      <w:r>
+        <w:lastRenderedPageBreak/>
+        <w:t>actionable insights, and the consumer layer delivers those insights to the appropriate stakeholders through purpose-built interfaces.</w:t>
       </w:r>
     </w:p>
     <w:p>
@@ -22862,7 +23017,6 @@
       </w:pPr>
       <w:bookmarkStart w:id="70" w:name="_Toc241456013"/>
       <w:r>
-        <w:lastRenderedPageBreak/>
         <w:t>10.2</w:t>
       </w:r>
       <w:r>
@@ -23074,7 +23228,11 @@
         <w:t>budget_code</w:t>
       </w:r>
       <w:r>
-        <w:t>, and introduced CloudWatch Logs Insights widgets for error log surfacing. Rather than relying solely on Errors metrics from the AWS/Lambda namespace, the Logs Insights widgets queried the /aws/lambda/ log group prefix directly, enabling pattern-matched error extraction regardless of whether Lambda had published a corresponding metric.</w:t>
+        <w:t xml:space="preserve">, and introduced CloudWatch Logs Insights widgets for error log surfacing. Rather than relying solely on Errors metrics from the AWS/Lambda namespace, </w:t>
+      </w:r>
+      <w:r>
+        <w:lastRenderedPageBreak/>
+        <w:t>the Logs Insights widgets queried the /aws/lambda/ log group prefix directly, enabling pattern-matched error extraction regardless of whether Lambda had published a corresponding metric.</w:t>
       </w:r>
     </w:p>
     <w:p>
@@ -23085,7 +23243,6 @@
         <w:ind w:right="-94"/>
       </w:pPr>
       <w:r>
-        <w:lastRenderedPageBreak/>
         <w:t xml:space="preserve">A significant architectural investigation within this task evaluated the feasibility of a fully centralized log aggregation approach using CloudWatch metric subscription filters. My analysis quantified the infrastructure cost of this design: routing log events from all IA Lambda functions into a centralized processing layer would require </w:t>
       </w:r>
       <w:r>
@@ -24473,6 +24630,7 @@
                 <w:sz w:val="24"/>
                 <w:szCs w:val="24"/>
               </w:rPr>
+              <w:lastRenderedPageBreak/>
               <w:t>7</w:t>
             </w:r>
           </w:p>
@@ -24635,7 +24793,6 @@
                 <w:sz w:val="24"/>
                 <w:szCs w:val="24"/>
               </w:rPr>
-              <w:lastRenderedPageBreak/>
               <w:t>9</w:t>
             </w:r>
           </w:p>
@@ -27339,6 +27496,7 @@
                 <w:sz w:val="24"/>
                 <w:szCs w:val="24"/>
               </w:rPr>
+              <w:lastRenderedPageBreak/>
               <w:t>GET /api/v1/ec2</w:t>
             </w:r>
           </w:p>
@@ -27394,7 +27552,6 @@
                 <w:sz w:val="24"/>
                 <w:szCs w:val="24"/>
               </w:rPr>
-              <w:lastRenderedPageBreak/>
               <w:t>GET /api/v1/secrets</w:t>
             </w:r>
           </w:p>
@@ -28191,6 +28348,7 @@
       </w:pPr>
       <w:bookmarkStart w:id="106" w:name="_Toc241456016"/>
       <w:r>
+        <w:lastRenderedPageBreak/>
         <w:t>10.5</w:t>
       </w:r>
       <w:r>
@@ -28233,7 +28391,6 @@
         <w:rPr>
           <w:b/>
         </w:rPr>
-        <w:lastRenderedPageBreak/>
         <w:t xml:space="preserve">L1 — Ask Citco RPA </w:t>
       </w:r>
       <w:r>
@@ -28375,6 +28532,7 @@
         <w:pStyle w:val="SubSection"/>
       </w:pPr>
       <w:r>
+        <w:lastRenderedPageBreak/>
         <w:t>10.5.2</w:t>
       </w:r>
       <w:r>
@@ -28426,7 +28584,6 @@
         <w:rPr>
           <w:b/>
         </w:rPr>
-        <w:lastRenderedPageBreak/>
         <w:t xml:space="preserve">Week 12 </w:t>
       </w:r>
       <w:r>
@@ -28580,6 +28737,7 @@
         <w:rPr>
           <w:b/>
         </w:rPr>
+        <w:lastRenderedPageBreak/>
         <w:t>VPL IPV</w:t>
       </w:r>
       <w:r>
@@ -28591,7 +28749,6 @@
         <w:pStyle w:val="SubSection"/>
       </w:pPr>
       <w:r>
-        <w:lastRenderedPageBreak/>
         <w:t>10.5.4</w:t>
       </w:r>
       <w:r>
@@ -29031,14 +29188,11 @@
         <w:rPr>
           <w:b/>
         </w:rPr>
+        <w:lastRenderedPageBreak/>
         <w:t xml:space="preserve">52% timeout rate on IRCOEKBExtractLambda. </w:t>
       </w:r>
       <w:r>
-        <w:t xml:space="preserve">77 of 148 production runs hit the 300-second Lambda timeout. June 2026 was the worst month at 71% timeout rate. Average run </w:t>
-      </w:r>
-      <w:r>
-        <w:lastRenderedPageBreak/>
-        <w:t>duration was 291 seconds — every run within 36 seconds of the limit. When the Lambda timed out, the Knowledge Base was incomplete for that day: pages not yet uploaded when the timeout fired were missing from the KB until the next successful run.</w:t>
+        <w:t>77 of 148 production runs hit the 300-second Lambda timeout. June 2026 was the worst month at 71% timeout rate. Average run duration was 291 seconds — every run within 36 seconds of the limit. When the Lambda timed out, the Knowledge Base was incomplete for that day: pages not yet uploaded when the timeout fired were missing from the KB until the next successful run.</w:t>
       </w:r>
     </w:p>
     <w:p>
@@ -29233,6 +29387,7 @@
         <w:rPr>
           <w:b/>
         </w:rPr>
+        <w:lastRenderedPageBreak/>
         <w:t>Fire-and-forget Lambda pattern</w:t>
       </w:r>
       <w:r>
@@ -29252,7 +29407,6 @@
         <w:rPr>
           <w:b/>
         </w:rPr>
-        <w:lastRenderedPageBreak/>
         <w:t>Athena SSE encryption inconsistency</w:t>
       </w:r>
       <w:r>
@@ -29483,6 +29637,7 @@
         <w:rPr>
           <w:b/>
         </w:rPr>
+        <w:lastRenderedPageBreak/>
         <w:t>Kill switch</w:t>
       </w:r>
       <w:r>
@@ -29502,7 +29657,6 @@
         <w:rPr>
           <w:b/>
         </w:rPr>
-        <w:lastRenderedPageBreak/>
         <w:t>X-Ray tracing</w:t>
       </w:r>
       <w:r>
@@ -29635,6 +29789,7 @@
         <w:pStyle w:val="SubSection"/>
       </w:pPr>
       <w:r>
+        <w:lastRenderedPageBreak/>
         <w:t>10.7.1</w:t>
       </w:r>
       <w:r>
@@ -29667,7 +29822,6 @@
         <w:rPr>
           <w:b/>
         </w:rPr>
-        <w:lastRenderedPageBreak/>
         <w:t>Gap</w:t>
       </w:r>
       <w:r>
@@ -30437,6 +30591,7 @@
         <w:rPr>
           <w:b/>
         </w:rPr>
+        <w:lastRenderedPageBreak/>
         <w:t>Infrastructure Inventory Dashboard</w:t>
       </w:r>
       <w:r>
@@ -30456,7 +30611,6 @@
         <w:rPr>
           <w:b/>
         </w:rPr>
-        <w:lastRenderedPageBreak/>
         <w:t>Infrastructure Monitoring Dashboard</w:t>
       </w:r>
       <w:r>
@@ -31267,6 +31421,7 @@
       </w:pPr>
       <w:bookmarkStart w:id="113" w:name="_Toc241456019"/>
       <w:r>
+        <w:lastRenderedPageBreak/>
         <w:t>10.8</w:t>
       </w:r>
       <w:r>
@@ -31292,7 +31447,6 @@
         <w:pStyle w:val="SubSection"/>
       </w:pPr>
       <w:r>
-        <w:lastRenderedPageBreak/>
         <w:t>10.8.1</w:t>
       </w:r>
       <w:r>
@@ -31539,6 +31693,7 @@
         <w:rPr>
           <w:b/>
         </w:rPr>
+        <w:lastRenderedPageBreak/>
         <w:t xml:space="preserve">Tradeoff. </w:t>
       </w:r>
       <w:r>
@@ -31556,7 +31711,6 @@
         <w:pStyle w:val="SubSection"/>
       </w:pPr>
       <w:r>
-        <w:lastRenderedPageBreak/>
         <w:t>10.8.2</w:t>
       </w:r>
       <w:r>
@@ -31822,6 +31976,7 @@
         <w:rPr>
           <w:b/>
         </w:rPr>
+        <w:lastRenderedPageBreak/>
         <w:t>No additional infrastructure</w:t>
       </w:r>
       <w:r>
@@ -31841,7 +31996,6 @@
         <w:rPr>
           <w:b/>
         </w:rPr>
-        <w:lastRenderedPageBreak/>
         <w:t>Amazon Managed Grafana constraint</w:t>
       </w:r>
       <w:r>
@@ -32015,6 +32169,7 @@
         <w:rPr>
           <w:b/>
         </w:rPr>
+        <w:lastRenderedPageBreak/>
         <w:t>Fleet-scale coverage</w:t>
       </w:r>
       <w:r>
@@ -32034,7 +32189,6 @@
         <w:rPr>
           <w:b/>
         </w:rPr>
-        <w:lastRenderedPageBreak/>
         <w:t>Avoids static YAML maintenance</w:t>
       </w:r>
       <w:r>
@@ -32212,6 +32366,7 @@
           <w:b/>
           <w:bCs/>
         </w:rPr>
+        <w:lastRenderedPageBreak/>
         <w:t>Team Introduction and Placement Overview</w:t>
       </w:r>
       <w:r>
@@ -32222,11 +32377,7 @@
         <w:t xml:space="preserve">: </w:t>
       </w:r>
       <w:r>
-        <w:t xml:space="preserve">I joined the Intelligent Automation SRE team at Citco Technology Management. The introductory meeting with my manager, Mr. Deotale, gave me a comprehensive overview of the team structure, the six IA budget_code platforms I would be monitoring, and the co-op placement expectations. Senior mentors Mr. Leung and Ms. Labos </w:t>
-      </w:r>
-      <w:r>
-        <w:lastRenderedPageBreak/>
-        <w:t>introduced themselves and outlined their roles:</w:t>
+        <w:t>I joined the Intelligent Automation SRE team at Citco Technology Management. The introductory meeting with my manager, Mr. Deotale, gave me a comprehensive overview of the team structure, the six IA budget_code platforms I would be monitoring, and the co-op placement expectations. Senior mentors Mr. Leung and Ms. Labos introduced themselves and outlined their roles:</w:t>
       </w:r>
       <w:r>
         <w:t xml:space="preserve"> </w:t>
@@ -32303,7 +32454,15 @@
         <w:t>ing</w:t>
       </w:r>
       <w:r>
-        <w:t xml:space="preserve"> was conducted by the Red Team on UAT only to protect production uptime); and the access logging infrastructure built on the ELK stack (Kibana, Elasticsearch) with 7–14 day log retention policies. I also learned about Dynatrace application monitoring for anomaly detection and alerting—knowledge that would become directly relevant when I later evaluated Dynatrace parity as a framing question for the Grafana AMG dashboard work.</w:t>
+        <w:t xml:space="preserve"> was conducted by the Red Team on UAT only to protect production uptime); and the access logging infrastructure built on the ELK stack (Kibana, Elasticsearch) with 7–</w:t>
+      </w:r>
+      <w:proofErr w:type="gramStart"/>
+      <w:r>
+        <w:t>14 day</w:t>
+      </w:r>
+      <w:proofErr w:type="gramEnd"/>
+      <w:r>
+        <w:t xml:space="preserve"> log retention policies. I also learned about Dynatrace application monitoring for anomaly detection and alerting—knowledge that would become directly relevant when I later evaluated Dynatrace parity as a framing question for the Grafana AMG dashboard work.</w:t>
       </w:r>
     </w:p>
     <w:p>
@@ -32330,7 +32489,11 @@
     </w:p>
     <w:p>
       <w:r>
-        <w:t xml:space="preserve">Q and the Amazon Tools ecosystem, which included a walkthrough of the AWS developer toolchain available to the team. I familiarized myself with the Citco JIRA board (IISS project), read the team’s active Confluence pages covering the IA platform overview, and reviewed the existing tickets on the board to understand what work was in progress before my arrival. I attended the team’s daily standup for the first time and began </w:t>
+        <w:t xml:space="preserve">Q and the Amazon Tools ecosystem, which included a walkthrough of the AWS developer toolchain available to the team. I familiarized myself with the Citco JIRA board (IISS project), read </w:t>
+      </w:r>
+      <w:r>
+        <w:lastRenderedPageBreak/>
+        <w:t xml:space="preserve">the team’s active Confluence pages covering the IA platform overview, and reviewed the existing tickets on the board to understand what work was in progress before my arrival. I attended the team’s daily standup for the first time and began </w:t>
       </w:r>
       <w:r>
         <w:t>synchronizing</w:t>
@@ -32341,7 +32504,6 @@
     </w:p>
     <w:p>
       <w:r>
-        <w:lastRenderedPageBreak/>
         <w:t>By the end of Week 1, all access requests were submitted and in progress, my local development environment was fully operational, and I had a solid understanding of Citco's security posture, the IA platform scope, and the team's operational rhythm.</w:t>
       </w:r>
     </w:p>
@@ -32503,7 +32665,11 @@
         <w:t xml:space="preserve"> </w:t>
       </w:r>
       <w:r>
-        <w:t>traversal, SPARQL for standards‐based semantic integration. This distinction proved relevant</w:t>
+        <w:t>traversal, SPARQL for standards‐</w:t>
+      </w:r>
+      <w:r>
+        <w:lastRenderedPageBreak/>
+        <w:t>based semantic integration. This distinction proved relevant</w:t>
       </w:r>
       <w:r>
         <w:t xml:space="preserve"> </w:t>
@@ -32545,11 +32711,7 @@
         <w:t xml:space="preserve"> </w:t>
       </w:r>
       <w:r>
-        <w:t>audit‐</w:t>
-      </w:r>
-      <w:r>
-        <w:lastRenderedPageBreak/>
-        <w:t>grade transaction logs), and Amazon ElastiCache including both Redis (advanced data</w:t>
+        <w:t>audit‐grade transaction logs), and Amazon ElastiCache including both Redis (advanced data</w:t>
       </w:r>
       <w:r>
         <w:t xml:space="preserve"> </w:t>
@@ -32673,7 +32835,11 @@
         <w:t xml:space="preserve"> </w:t>
       </w:r>
       <w:r>
-        <w:t>dashboard. I first added CloudWatch metrics instrumentation to the rpacfs1‐cais‐pricingextract‐genai‐infrastructure codebase to track CTI submission activity through the pipeline. Rather</w:t>
+        <w:t>dashboard. I first added CloudWatch metrics instrumentation to the rpacfs1‐cais‐pricingextract‐genai‐</w:t>
+      </w:r>
+      <w:r>
+        <w:lastRenderedPageBreak/>
+        <w:t>infrastructure codebase to track CTI submission activity through the pipeline. Rather</w:t>
       </w:r>
       <w:r>
         <w:t xml:space="preserve"> </w:t>
@@ -32711,7 +32877,6 @@
         <w:ind w:right="-94"/>
       </w:pPr>
       <w:r>
-        <w:lastRenderedPageBreak/>
         <w:t>I updated the .gitignore to exclude virtual environment directories, pytest cache, and test</w:t>
       </w:r>
       <w:r>
@@ -32883,6 +33048,7 @@
       </w:pPr>
       <w:bookmarkStart w:id="118" w:name="_Toc241456024"/>
       <w:r>
+        <w:lastRenderedPageBreak/>
         <w:t>11.4</w:t>
       </w:r>
       <w:r>
@@ -32919,7 +33085,6 @@
         <w:rPr>
           <w:b/>
         </w:rPr>
-        <w:lastRenderedPageBreak/>
         <w:t>Merging</w:t>
       </w:r>
       <w:r>
@@ -33178,7 +33343,11 @@
         <w:t xml:space="preserve"> supporting</w:t>
       </w:r>
       <w:r>
-        <w:t xml:space="preserve"> subtask. The published page cataloged all 51 functions with trigger mappings (S3, SQS, EventBridge, API Gateway), memory configurations, timeout settings, runtime versions, and </w:t>
+        <w:t xml:space="preserve"> subtask. The published page cataloged all 51 functions with trigger mappings (S3, SQS, EventBridge, API Gateway), memory configurations, timeout </w:t>
+      </w:r>
+      <w:r>
+        <w:lastRenderedPageBreak/>
+        <w:t xml:space="preserve">settings, runtime versions, and </w:t>
       </w:r>
       <w:r>
         <w:t>budget_code</w:t>
@@ -33213,7 +33382,6 @@
         <w:t xml:space="preserve"> </w:t>
       </w:r>
       <w:r>
-        <w:lastRenderedPageBreak/>
         <w:t>documentation was live on Confluence—completing the part‐time phase and setting the stage for</w:t>
       </w:r>
       <w:r>
@@ -33381,6 +33549,7 @@
         <w:t xml:space="preserve"> </w:t>
       </w:r>
       <w:r>
+        <w:lastRenderedPageBreak/>
         <w:t>OpenSearch to AXI), the six ECS clusters hosting Meridian services, and consumer lag as the</w:t>
       </w:r>
       <w:r>
@@ -33414,7 +33583,6 @@
           <w:b/>
           <w:bCs/>
         </w:rPr>
-        <w:lastRenderedPageBreak/>
         <w:t xml:space="preserve">Dev Work and Meridian Production Incident: </w:t>
       </w:r>
       <w:r>
@@ -33593,7 +33761,11 @@
         <w:t xml:space="preserve"> </w:t>
       </w:r>
       <w:r>
-        <w:t>whether each Lambda function is invoked by SQS, API Gateway, or EventBridge. The test suite</w:t>
+        <w:t xml:space="preserve">whether each Lambda </w:t>
+      </w:r>
+      <w:r>
+        <w:lastRenderedPageBreak/>
+        <w:t>function is invoked by SQS, API Gateway, or EventBridge. The test suite</w:t>
       </w:r>
       <w:r>
         <w:t xml:space="preserve"> </w:t>
@@ -33629,11 +33801,7 @@
         <w:t xml:space="preserve"> </w:t>
       </w:r>
       <w:r>
-        <w:t xml:space="preserve">uses </w:t>
-      </w:r>
-      <w:r>
-        <w:lastRenderedPageBreak/>
-        <w:t>budget_code=”CFS/RPA” rather than the expected ”rpacfs1” value—and introduced the</w:t>
+        <w:t>uses budget_code=”CFS/RPA” rather than the expected ”rpacfs1” value—and introduced the</w:t>
       </w:r>
       <w:r>
         <w:t xml:space="preserve"> </w:t>
@@ -33824,7 +33992,11 @@
         <w:t xml:space="preserve"> </w:t>
       </w:r>
       <w:r>
-        <w:t>using !Sub and !Ref tags failed the check‐yaml pre‐commit hook; CFN files were excluded from</w:t>
+        <w:t xml:space="preserve">using !Sub and !Ref </w:t>
+      </w:r>
+      <w:r>
+        <w:lastRenderedPageBreak/>
+        <w:t>tags failed the check‐yaml pre‐commit hook; CFN files were excluded from</w:t>
       </w:r>
       <w:r>
         <w:t xml:space="preserve"> </w:t>
@@ -33846,7 +34018,6 @@
       </w:pPr>
       <w:bookmarkStart w:id="121" w:name="_Toc241456027"/>
       <w:r>
-        <w:lastRenderedPageBreak/>
         <w:t>11.7</w:t>
       </w:r>
       <w:r>
@@ -34028,6 +34199,7 @@
           <w:b/>
           <w:bCs/>
         </w:rPr>
+        <w:lastRenderedPageBreak/>
         <w:t xml:space="preserve">Dashboard Header Standardization and EC2 Polish: </w:t>
       </w:r>
       <w:r>
@@ -34055,7 +34227,6 @@
         <w:t xml:space="preserve"> </w:t>
       </w:r>
       <w:r>
-        <w:lastRenderedPageBreak/>
         <w:t>dashboard. I added trailing spaces to Markdown headers to ensure correct line‐break rendering</w:t>
       </w:r>
       <w:r>
@@ -34254,6 +34425,7 @@
         <w:t xml:space="preserve"> </w:t>
       </w:r>
       <w:r>
+        <w:lastRenderedPageBreak/>
         <w:t>onboarding, an Auto Rec Download configuration request (backing up and editing gridview.py and</w:t>
       </w:r>
       <w:r>
@@ -34272,11 +34444,7 @@
         <w:t xml:space="preserve"> </w:t>
       </w:r>
       <w:r>
-        <w:t xml:space="preserve">and </w:t>
-      </w:r>
-      <w:r>
-        <w:lastRenderedPageBreak/>
-        <w:t>this first live rotation, the RPA support model became familiar and manageable alongside</w:t>
+        <w:t>and this first live rotation, the RPA support model became familiar and manageable alongside</w:t>
       </w:r>
       <w:r>
         <w:t xml:space="preserve"> </w:t>
@@ -34429,7 +34597,11 @@
         <w:t xml:space="preserve"> </w:t>
       </w:r>
       <w:r>
-        <w:t>week. A naive single‐stage tag filter would conflate operationally unrelated resources from two</w:t>
+        <w:t xml:space="preserve">week. </w:t>
+      </w:r>
+      <w:r>
+        <w:lastRenderedPageBreak/>
+        <w:t>A naive single‐stage tag filter would conflate operationally unrelated resources from two</w:t>
       </w:r>
       <w:r>
         <w:t xml:space="preserve"> </w:t>
@@ -34447,11 +34619,7 @@
         <w:t xml:space="preserve"> </w:t>
       </w:r>
       <w:r>
-        <w:t xml:space="preserve">throughout </w:t>
-      </w:r>
-      <w:r>
-        <w:lastRenderedPageBreak/>
-        <w:t>the inventory API in subsequent months. Additionally, five of the six Meridian ECS</w:t>
+        <w:t>throughout the inventory API in subsequent months. Additionally, five of the six Meridian ECS</w:t>
       </w:r>
       <w:r>
         <w:t xml:space="preserve"> </w:t>
@@ -34627,6 +34795,7 @@
         <w:t xml:space="preserve"> </w:t>
       </w:r>
       <w:r>
+        <w:lastRenderedPageBreak/>
         <w:t>coverage on the agentic‐AI subsystem, then 100% coverage on trigger_rules and orchestrator—a</w:t>
       </w:r>
       <w:r>
@@ -34648,7 +34817,6 @@
           <w:b/>
           <w:bCs/>
         </w:rPr>
-        <w:lastRenderedPageBreak/>
         <w:t xml:space="preserve">SQS Panel Fixes and Grafana 12.4 Upgrade: </w:t>
       </w:r>
       <w:r>
@@ -34837,6 +35005,7 @@
         <w:t xml:space="preserve"> </w:t>
       </w:r>
       <w:r>
+        <w:lastRenderedPageBreak/>
         <w:t>incident peak queue depth of approximately nine million messages, setting the warning level well</w:t>
       </w:r>
       <w:r>
@@ -34849,7 +35018,6 @@
         <w:t xml:space="preserve"> </w:t>
       </w:r>
       <w:r>
-        <w:lastRenderedPageBreak/>
         <w:t>knowledge transfer workshop with Mr. Deotale, Mr. Nathaniel, and two additional team members</w:t>
       </w:r>
       <w:r>
@@ -35044,7 +35212,11 @@
         <w:t xml:space="preserve"> </w:t>
       </w:r>
       <w:r>
-        <w:t>CITCO‐S3ForceEncryptNoPublic bucket policy. I updated the provisioner Lambda to fetch content</w:t>
+        <w:t>CITCO‐</w:t>
+      </w:r>
+      <w:r>
+        <w:lastRenderedPageBreak/>
+        <w:t>S3ForceEncryptNoPublic bucket policy. I updated the provisioner Lambda to fetch content</w:t>
       </w:r>
       <w:r>
         <w:t xml:space="preserve"> </w:t>
@@ -35065,7 +35237,6 @@
           <w:b/>
           <w:bCs/>
         </w:rPr>
-        <w:lastRenderedPageBreak/>
         <w:t xml:space="preserve">Agentic AI System Refactor and 597‐Test Milestone: </w:t>
       </w:r>
       <w:r>
@@ -35262,7 +35433,11 @@
         <w:t xml:space="preserve"> </w:t>
       </w:r>
       <w:r>
-        <w:t>post‐mortem. I enhanced ECS metrics to show CPU and memory usage MAX per service ordered</w:t>
+        <w:t xml:space="preserve">post‐mortem. I enhanced </w:t>
+      </w:r>
+      <w:r>
+        <w:lastRenderedPageBreak/>
+        <w:t>ECS metrics to show CPU and memory usage MAX per service ordered</w:t>
       </w:r>
       <w:r>
         <w:t xml:space="preserve"> </w:t>
@@ -35283,7 +35458,6 @@
           <w:b/>
           <w:bCs/>
         </w:rPr>
-        <w:lastRenderedPageBreak/>
         <w:t xml:space="preserve">Redis/Valkey Row and Dashboard Visual Polish: </w:t>
       </w:r>
       <w:r>
@@ -35523,6 +35697,7 @@
         <w:ind w:right="-94"/>
       </w:pPr>
       <w:r>
+        <w:lastRenderedPageBreak/>
         <w:t>By the end of Week 11, all 13 dashboard rows were built and deployed, the OpenSearch JVM</w:t>
       </w:r>
       <w:r>
@@ -35550,7 +35725,6 @@
           <w:b/>
           <w:bCs/>
         </w:rPr>
-        <w:lastRenderedPageBreak/>
         <w:t xml:space="preserve">Alarm Architecture Decision (EventBridge vs Scheduled Lambda): </w:t>
       </w:r>
       <w:r>
@@ -35746,7 +35920,11 @@
         <w:t xml:space="preserve"> </w:t>
       </w:r>
       <w:r>
-        <w:t>them to retrigger after correction; and an Auto Rec Download CAPULA2 configuration update: I</w:t>
+        <w:t xml:space="preserve">them to retrigger after correction; and an Auto Rec Download CAPULA2 </w:t>
+      </w:r>
+      <w:r>
+        <w:lastRenderedPageBreak/>
+        <w:t>configuration update: I</w:t>
       </w:r>
       <w:r>
         <w:t xml:space="preserve"> </w:t>
@@ -35781,7 +35959,6 @@
         <w:t xml:space="preserve"> </w:t>
       </w:r>
       <w:r>
-        <w:lastRenderedPageBreak/>
         <w:t>walkthroughs for the MESO ECS autoscaling failure I encountered this week. During the support</w:t>
       </w:r>
       <w:r>
@@ -35955,7 +36132,11 @@
         <w:t xml:space="preserve"> </w:t>
       </w:r>
       <w:r>
-        <w:t>disk I/O. Test coverage for the EC2 dashboard package reached 96% across all widget types and</w:t>
+        <w:t xml:space="preserve">disk </w:t>
+      </w:r>
+      <w:r>
+        <w:lastRenderedPageBreak/>
+        <w:t>I/O. Test coverage for the EC2 dashboard package reached 96% across all widget types and</w:t>
       </w:r>
       <w:r>
         <w:t xml:space="preserve"> </w:t>
@@ -35988,7 +36169,6 @@
       </w:pPr>
       <w:bookmarkStart w:id="127" w:name="_Toc241456033"/>
       <w:r>
-        <w:lastRenderedPageBreak/>
         <w:t>11.13</w:t>
       </w:r>
       <w:r>
@@ -36293,6 +36473,7 @@
           <w:b/>
           <w:bCs/>
         </w:rPr>
+        <w:lastRenderedPageBreak/>
         <w:t xml:space="preserve">Inventory API Scaffold: </w:t>
       </w:r>
       <w:r>
@@ -36370,7 +36551,6 @@
           <w:b/>
           <w:bCs/>
         </w:rPr>
-        <w:lastRenderedPageBreak/>
         <w:t xml:space="preserve">CloudFormation Template Size Constraint: </w:t>
       </w:r>
       <w:r>
@@ -36580,6 +36760,7 @@
           <w:b/>
           <w:bCs/>
         </w:rPr>
+        <w:lastRenderedPageBreak/>
         <w:t xml:space="preserve">Row Restructuring and Visual Consistency: </w:t>
       </w:r>
       <w:r>
@@ -36619,11 +36800,7 @@
         <w:t xml:space="preserve"> </w:t>
       </w:r>
       <w:r>
-        <w:t xml:space="preserve">state history panel </w:t>
-      </w:r>
-      <w:r>
-        <w:lastRenderedPageBreak/>
-        <w:t>after discovering that applying seriesToRows before filterFieldsByName</w:t>
+        <w:t>state history panel after discovering that applying seriesToRows before filterFieldsByName</w:t>
       </w:r>
       <w:r>
         <w:t xml:space="preserve"> </w:t>
@@ -36798,6 +36975,7 @@
         <w:t xml:space="preserve"> </w:t>
       </w:r>
       <w:r>
+        <w:lastRenderedPageBreak/>
         <w:t>+ Topic triple‐axis structure to enable topic‐level drill‐down. I corrected the MSK cluster ARN chain</w:t>
       </w:r>
       <w:r>
@@ -36837,7 +37015,6 @@
           <w:b/>
           <w:bCs/>
         </w:rPr>
-        <w:lastRenderedPageBreak/>
         <w:t xml:space="preserve">Six Resource Mapper Lambdas: </w:t>
       </w:r>
       <w:r>
@@ -37009,6 +37186,7 @@
         <w:t xml:space="preserve"> </w:t>
       </w:r>
       <w:r>
+        <w:lastRenderedPageBreak/>
         <w:t>correctly detected code changes between deploys—the prior filename‐only approach caused</w:t>
       </w:r>
       <w:r>
@@ -37056,7 +37234,6 @@
           <w:b/>
           <w:bCs/>
         </w:rPr>
-        <w:lastRenderedPageBreak/>
         <w:t xml:space="preserve">RPA Production Support Rotation: </w:t>
       </w:r>
       <w:r>
@@ -37254,6 +37431,7 @@
           <w:b/>
           <w:bCs/>
         </w:rPr>
+        <w:lastRenderedPageBreak/>
         <w:t xml:space="preserve">Canada Day Operational Coverage: </w:t>
       </w:r>
       <w:r>
@@ -37293,11 +37471,7 @@
         <w:t xml:space="preserve"> </w:t>
       </w:r>
       <w:r>
-        <w:t xml:space="preserve">discrepancy alarm that </w:t>
-      </w:r>
-      <w:r>
-        <w:lastRenderedPageBreak/>
-        <w:t>would surface this class of silent failure automatically. The two‐stage</w:t>
+        <w:t>discrepancy alarm that would surface this class of silent failure automatically. The two‐stage</w:t>
       </w:r>
       <w:r>
         <w:t xml:space="preserve"> </w:t>
@@ -37455,7 +37629,11 @@
         <w:t xml:space="preserve"> </w:t>
       </w:r>
       <w:r>
-        <w:t>compiled a team‐requests.md document comparing structured vs unstructured logging patterns</w:t>
+        <w:t xml:space="preserve">compiled a </w:t>
+      </w:r>
+      <w:r>
+        <w:lastRenderedPageBreak/>
+        <w:t>team‐requests.md document comparing structured vs unstructured logging patterns</w:t>
       </w:r>
       <w:r>
         <w:t xml:space="preserve"> </w:t>
@@ -37511,7 +37689,6 @@
         <w:ind w:right="-94"/>
       </w:pPr>
       <w:r>
-        <w:lastRenderedPageBreak/>
         <w:t>By the end of Week 17, the inventory API was production‐deployed at v1.5.0 with CI/CD, the X‐Ray</w:t>
       </w:r>
       <w:r>
@@ -37693,7 +37870,11 @@
         <w:t xml:space="preserve"> </w:t>
       </w:r>
       <w:r>
-        <w:t>platform types, handling the differences in log group naming conventions between Lambda, ECS,</w:t>
+        <w:t xml:space="preserve">platform </w:t>
+      </w:r>
+      <w:r>
+        <w:lastRenderedPageBreak/>
+        <w:t>types, handling the differences in log group naming conventions between Lambda, ECS,</w:t>
       </w:r>
       <w:r>
         <w:t xml:space="preserve"> </w:t>
@@ -37750,7 +37931,6 @@
           <w:b/>
           <w:bCs/>
         </w:rPr>
-        <w:lastRenderedPageBreak/>
         <w:t xml:space="preserve">Five‐Phase Log Group Observability Specification: </w:t>
       </w:r>
       <w:r>
@@ -37914,6 +38094,7 @@
       </w:pPr>
       <w:bookmarkStart w:id="133" w:name="_Toc241456039"/>
       <w:r>
+        <w:lastRenderedPageBreak/>
         <w:t>11.19</w:t>
       </w:r>
       <w:r>
@@ -37966,11 +38147,7 @@
         <w:t xml:space="preserve"> </w:t>
       </w:r>
       <w:r>
-        <w:t xml:space="preserve">analysis, </w:t>
-      </w:r>
-      <w:r>
-        <w:lastRenderedPageBreak/>
-        <w:t>audit events, and resource utilization) across seven platforms. The script queries the live</w:t>
+        <w:t>analysis, audit events, and resource utilization) across seven platforms. The script queries the live</w:t>
       </w:r>
       <w:r>
         <w:t xml:space="preserve"> </w:t>
@@ -38183,6 +38360,7 @@
         <w:t xml:space="preserve"> </w:t>
       </w:r>
       <w:r>
+        <w:lastRenderedPageBreak/>
         <w:t>produced empty panels rather than misleading cross‐platform data leakage. I renamed the</w:t>
       </w:r>
       <w:r>
@@ -38229,7 +38407,6 @@
       </w:pPr>
       <w:bookmarkStart w:id="134" w:name="_Toc241456040"/>
       <w:r>
-        <w:lastRenderedPageBreak/>
         <w:t>11.20</w:t>
       </w:r>
       <w:r>
@@ -38444,6 +38621,7 @@
           <w:b/>
           <w:bCs/>
         </w:rPr>
+        <w:lastRenderedPageBreak/>
         <w:t xml:space="preserve">SRE Platform v2.19.9 Release: </w:t>
       </w:r>
       <w:r>
@@ -38497,7 +38675,6 @@
           <w:b/>
           <w:bCs/>
         </w:rPr>
-        <w:lastRenderedPageBreak/>
         <w:t xml:space="preserve">RPA Support Operational Detail: </w:t>
       </w:r>
       <w:r>
@@ -38677,6 +38854,7 @@
           <w:b/>
           <w:bCs/>
         </w:rPr>
+        <w:lastRenderedPageBreak/>
         <w:t xml:space="preserve">handler_utils Decorators and Test Milestone: </w:t>
       </w:r>
       <w:r>
@@ -38749,7 +38927,6 @@
         <w:t xml:space="preserve"> </w:t>
       </w:r>
       <w:r>
-        <w:lastRenderedPageBreak/>
         <w:t>(all roles and policies), cfn.lambda (function definitions), cfn.bedrock (agent and knowledge</w:t>
       </w:r>
       <w:r>
@@ -38916,7 +39093,11 @@
         <w:t xml:space="preserve"> </w:t>
       </w:r>
       <w:r>
-        <w:t>memory to production values (512 CPU units / 1,024 MB) based on CloudWatch utilization data</w:t>
+        <w:t xml:space="preserve">memory to production values </w:t>
+      </w:r>
+      <w:r>
+        <w:lastRenderedPageBreak/>
+        <w:t>(512 CPU units / 1,024 MB) based on CloudWatch utilization data</w:t>
       </w:r>
       <w:r>
         <w:t xml:space="preserve"> </w:t>
@@ -38999,11 +39180,7 @@
         <w:t xml:space="preserve"> </w:t>
       </w:r>
       <w:r>
-        <w:t xml:space="preserve">with four </w:t>
-      </w:r>
-      <w:r>
-        <w:lastRenderedPageBreak/>
-        <w:t>modules (auth, s3, sync, bucket), an –env flag with production confirmation prompt, a</w:t>
+        <w:t>with four modules (auth, s3, sync, bucket), an –env flag with production confirmation prompt, a</w:t>
       </w:r>
       <w:r>
         <w:t xml:space="preserve"> </w:t>
@@ -39153,7 +39330,11 @@
         <w:t xml:space="preserve"> </w:t>
       </w:r>
       <w:r>
-        <w:t>By the end of Week 22, the KB upload CLI was tested and functional, the Bedrock agent instruction</w:t>
+        <w:t xml:space="preserve">By the end of Week 22, the KB upload CLI was tested and functional, the </w:t>
+      </w:r>
+      <w:r>
+        <w:lastRenderedPageBreak/>
+        <w:t>Bedrock agent instruction</w:t>
       </w:r>
       <w:r>
         <w:t xml:space="preserve"> </w:t>
@@ -39225,11 +39406,7 @@
         <w:t xml:space="preserve"> </w:t>
       </w:r>
       <w:r>
-        <w:t xml:space="preserve">Æxeo report requests via </w:t>
-      </w:r>
-      <w:r>
-        <w:lastRenderedPageBreak/>
-        <w:t>the GET /arguments API endpoint using ReportID: 100502500, value</w:t>
+        <w:t>Æxeo report requests via the GET /arguments API endpoint using ReportID: 100502500, value</w:t>
       </w:r>
       <w:r>
         <w:t xml:space="preserve"> </w:t>
@@ -39375,7 +39552,11 @@
         <w:t xml:space="preserve"> </w:t>
       </w:r>
       <w:r>
-        <w:t>S3 data at module import time required a cold‐start fix—these cannot be instrumented at</w:t>
+        <w:t xml:space="preserve">S3 data </w:t>
+      </w:r>
+      <w:r>
+        <w:lastRenderedPageBreak/>
+        <w:t>at module import time required a cold‐start fix—these cannot be instrumented at</w:t>
       </w:r>
       <w:r>
         <w:t xml:space="preserve"> </w:t>
@@ -39441,7 +39622,6 @@
         <w:t xml:space="preserve"> </w:t>
       </w:r>
       <w:r>
-        <w:lastRenderedPageBreak/>
         <w:t xml:space="preserve">alarm </w:t>
       </w:r>
       <w:r>
@@ -39595,6 +39775,7 @@
           <w:b/>
           <w:bCs/>
         </w:rPr>
+        <w:lastRenderedPageBreak/>
         <w:t xml:space="preserve">RPA Production Support Rotation: </w:t>
       </w:r>
       <w:r>
@@ -39664,11 +39845,7 @@
         <w:t xml:space="preserve"> </w:t>
       </w:r>
       <w:r>
-        <w:t xml:space="preserve">in </w:t>
-      </w:r>
-      <w:r>
-        <w:lastRenderedPageBreak/>
-        <w:t>the Master tab that was preventing file detection, removed it, and confirmed the file was</w:t>
+        <w:t>in the Master tab that was preventing file detection, removed it, and confirmed the file was</w:t>
       </w:r>
       <w:r>
         <w:t xml:space="preserve"> </w:t>
@@ -39818,7 +39995,11 @@
         <w:t xml:space="preserve"> </w:t>
       </w:r>
       <w:r>
-        <w:t>together over a call. I had previously assisted Mr. Deotale with a similar case (triggering reports</w:t>
+        <w:t xml:space="preserve">together </w:t>
+      </w:r>
+      <w:r>
+        <w:lastRenderedPageBreak/>
+        <w:t>over a call. I had previously assisted Mr. Deotale with a similar case (triggering reports</w:t>
       </w:r>
       <w:r>
         <w:t xml:space="preserve"> </w:t>
@@ -39877,7 +40058,6 @@
         <w:ind w:right="-94"/>
       </w:pPr>
       <w:r>
-        <w:lastRenderedPageBreak/>
         <w:t>To deliver the reports manually, Mr. Leung triggered them via the Postman API. Once the reporting</w:t>
       </w:r>
       <w:r>
@@ -40015,7 +40195,11 @@
         <w:t xml:space="preserve"> </w:t>
       </w:r>
       <w:r>
-        <w:t>set hang caused by a uv dependency group issue and a missing boto3 timeout on the change set</w:t>
+        <w:t xml:space="preserve">set </w:t>
+      </w:r>
+      <w:r>
+        <w:lastRenderedPageBreak/>
+        <w:t>hang caused by a uv dependency group issue and a missing boto3 timeout on the change set</w:t>
       </w:r>
       <w:r>
         <w:t xml:space="preserve"> </w:t>
@@ -40069,7 +40253,6 @@
         <w:t xml:space="preserve"> </w:t>
       </w:r>
       <w:r>
-        <w:lastRenderedPageBreak/>
         <w:t>documentation was live on Confluence and four workstreams were formally scoped for the</w:t>
       </w:r>
       <w:r>
@@ -40234,6 +40417,7 @@
         <w:t xml:space="preserve"> </w:t>
       </w:r>
       <w:r>
+        <w:lastRenderedPageBreak/>
         <w:t>migration plan I had documented. This alignment session ensured the portal team could continue</w:t>
       </w:r>
       <w:r>
@@ -40278,7 +40462,6 @@
       </w:pPr>
       <w:bookmarkStart w:id="140" w:name="_Toc241456046"/>
       <w:r>
-        <w:lastRenderedPageBreak/>
         <w:t>12.</w:t>
       </w:r>
       <w:r>
@@ -40358,6 +40541,7 @@
     <w:p>
       <w:pPr>
         <w:pStyle w:val="Caption"/>
+        <w:spacing w:after="0"/>
       </w:pPr>
       <w:bookmarkStart w:id="142" w:name="_Ref240880927"/>
       <w:bookmarkStart w:id="143" w:name="_Toc240883146"/>
@@ -41093,6 +41277,7 @@
                 <w:sz w:val="24"/>
                 <w:szCs w:val="24"/>
               </w:rPr>
+              <w:lastRenderedPageBreak/>
               <w:t>6</w:t>
             </w:r>
           </w:p>
@@ -41417,7 +41602,6 @@
                 <w:sz w:val="24"/>
                 <w:szCs w:val="24"/>
               </w:rPr>
-              <w:lastRenderedPageBreak/>
               <w:t>9</w:t>
             </w:r>
           </w:p>
@@ -41969,6 +42153,7 @@
     <w:p>
       <w:pPr>
         <w:pStyle w:val="Caption"/>
+        <w:spacing w:after="0"/>
       </w:pPr>
       <w:bookmarkStart w:id="145" w:name="_Toc240883147"/>
       <w:r>
@@ -42253,6 +42438,7 @@
         <w:ind w:right="-94"/>
       </w:pPr>
       <w:r>
+        <w:lastRenderedPageBreak/>
         <w:t>The following chapters present the detailed evidence for each outcome: Chapter 13 covers deliverables and impact, Chapter 14 documents the engineering obstacles, and Chapter 15 outlines the planned next steps.</w:t>
       </w:r>
     </w:p>
@@ -42280,11 +42466,7 @@
         <w:ind w:right="-94"/>
       </w:pPr>
       <w:r>
-        <w:t xml:space="preserve">Working on the IA-IT-SRE Infrastructure at Citco Technology Management, I achieved several significant milestones across observability platform development, API engineering, and production </w:t>
-      </w:r>
-      <w:r>
-        <w:lastRenderedPageBreak/>
-        <w:t>support operations. These accomplishments highlight my technical growth and the business value delivered during the co-op placement.</w:t>
+        <w:t>Working on the IA-IT-SRE Infrastructure at Citco Technology Management, I achieved several significant milestones across observability platform development, API engineering, and production support operations. These accomplishments highlight my technical growth and the business value delivered during the co-op placement.</w:t>
       </w:r>
     </w:p>
     <w:p>
@@ -42416,6 +42598,7 @@
         <w:rPr>
           <w:b/>
         </w:rPr>
+        <w:lastRenderedPageBreak/>
         <w:t xml:space="preserve">Infrastructure-as-Code Proficiency: </w:t>
       </w:r>
       <w:r>
@@ -42454,7 +42637,6 @@
         <w:rPr>
           <w:b/>
         </w:rPr>
-        <w:lastRenderedPageBreak/>
         <w:t xml:space="preserve">SRE Principles Application: </w:t>
       </w:r>
       <w:r>
@@ -42629,6 +42811,7 @@
         <w:rPr>
           <w:b/>
         </w:rPr>
+        <w:lastRenderedPageBreak/>
         <w:t xml:space="preserve">After: </w:t>
       </w:r>
       <w:r>
@@ -42663,7 +42846,6 @@
         <w:pStyle w:val="SubSection"/>
       </w:pPr>
       <w:r>
-        <w:lastRenderedPageBreak/>
         <w:t>13.2.2</w:t>
       </w:r>
       <w:r>
@@ -42789,13 +42971,29 @@
       <w:r>
         <w:t>These achievements reflect my ability to deliver production-grade engineering solutions while contributing directly to the operational reliability of Citco’s Intelligent Automation platform.</w:t>
       </w:r>
+      <w:bookmarkStart w:id="149" w:name="_Toc241456052"/>
+    </w:p>
+    <w:p>
+      <w:pPr>
+        <w:spacing w:line="278" w:lineRule="auto"/>
+        <w:jc w:val="left"/>
+        <w:rPr>
+          <w:b/>
+          <w:color w:val="8A0027"/>
+          <w:sz w:val="32"/>
+          <w:szCs w:val="28"/>
+        </w:rPr>
+      </w:pPr>
+      <w:r>
+        <w:br w:type="page"/>
+      </w:r>
     </w:p>
     <w:p>
       <w:pPr>
         <w:pStyle w:val="Chapter"/>
       </w:pPr>
-      <w:bookmarkStart w:id="149" w:name="_Toc241456052"/>
-      <w:r>
+      <w:r>
+        <w:lastRenderedPageBreak/>
         <w:t>14.</w:t>
       </w:r>
       <w:r>
@@ -42857,7 +43055,6 @@
         <w:rPr>
           <w:b/>
         </w:rPr>
-        <w:lastRenderedPageBreak/>
         <w:t xml:space="preserve">Metrics Insights SQL 10 TPS limit: </w:t>
       </w:r>
       <w:r>
@@ -43083,6 +43280,7 @@
         <w:rPr>
           <w:b/>
         </w:rPr>
+        <w:lastRenderedPageBreak/>
         <w:t xml:space="preserve">Metrics Insights SQL no regex in WHERE clause: </w:t>
       </w:r>
       <w:r>
@@ -43126,11 +43324,7 @@
         <w:t xml:space="preserve">Dashboard freezing from excessive datapoints: </w:t>
       </w:r>
       <w:r>
-        <w:t xml:space="preserve">Before dashboard-level variables were introduced, panels rendered all resources simultaneously—54+ Lambda functions, 17+ ALBs, 30+ ECS services. The browser froze for 10–15 seconds on load as Grafana attempted </w:t>
-      </w:r>
-      <w:r>
-        <w:lastRenderedPageBreak/>
-        <w:t xml:space="preserve">to render thousands of data points across 113 panels. </w:t>
+        <w:t xml:space="preserve">Before dashboard-level variables were introduced, panels rendered all resources simultaneously—54+ Lambda functions, 17+ ALBs, 30+ ECS services. The browser froze for 10–15 seconds on load as Grafana attempted to render thousands of data points across 113 panels. </w:t>
       </w:r>
       <w:r>
         <w:rPr>
@@ -43395,11 +43589,27 @@
     </w:p>
     <w:p>
       <w:pPr>
+        <w:spacing w:line="278" w:lineRule="auto"/>
+        <w:jc w:val="left"/>
+        <w:rPr>
+          <w:b/>
+          <w:color w:val="8A0027"/>
+          <w:sz w:val="28"/>
+          <w:szCs w:val="48"/>
+        </w:rPr>
+      </w:pPr>
+      <w:bookmarkStart w:id="152" w:name="_Toc241456055"/>
+      <w:r>
+        <w:br w:type="page"/>
+      </w:r>
+    </w:p>
+    <w:p>
+      <w:pPr>
         <w:pStyle w:val="Section"/>
         <w:ind w:right="-94"/>
       </w:pPr>
-      <w:bookmarkStart w:id="152" w:name="_Toc241456055"/>
-      <w:r>
+      <w:r>
+        <w:lastRenderedPageBreak/>
         <w:t>14.3</w:t>
       </w:r>
       <w:r>
@@ -43562,7 +43772,6 @@
         <w:rPr>
           <w:b/>
         </w:rPr>
-        <w:lastRenderedPageBreak/>
         <w:t xml:space="preserve">IAM permission boundaries: </w:t>
       </w:r>
       <w:r>
@@ -43748,6 +43957,7 @@
         <w:rPr>
           <w:b/>
         </w:rPr>
+        <w:lastRenderedPageBreak/>
         <w:t xml:space="preserve">Module-level credential caching: </w:t>
       </w:r>
       <w:r>
@@ -43891,7 +44101,6 @@
         <w:rPr>
           <w:b/>
         </w:rPr>
-        <w:lastRenderedPageBreak/>
         <w:t xml:space="preserve">Fix: </w:t>
       </w:r>
       <w:r>
@@ -44021,6 +44230,7 @@
         <w:rPr>
           <w:b/>
         </w:rPr>
+        <w:lastRenderedPageBreak/>
         <w:t xml:space="preserve">Managed services still require operational planning: </w:t>
       </w:r>
       <w:r>
@@ -44097,7 +44307,6 @@
       </w:pPr>
       <w:bookmarkStart w:id="156" w:name="_Toc241456059"/>
       <w:r>
-        <w:lastRenderedPageBreak/>
         <w:t>15.1</w:t>
       </w:r>
       <w:r>
@@ -44173,6 +44382,7 @@
         <w:pStyle w:val="SubSection"/>
       </w:pPr>
       <w:r>
+        <w:lastRenderedPageBreak/>
         <w:t>15.2.1</w:t>
       </w:r>
       <w:r>
@@ -44273,7 +44483,6 @@
         <w:ind w:right="-94"/>
       </w:pPr>
       <w:r>
-        <w:lastRenderedPageBreak/>
         <w:t>The alarm fires an SNS message to the ia-sre-</w:t>
       </w:r>
       <w:r>
@@ -44487,9 +44696,23 @@
     </w:p>
     <w:p>
       <w:pPr>
+        <w:spacing w:line="278" w:lineRule="auto"/>
+        <w:jc w:val="left"/>
+        <w:rPr>
+          <w:b/>
+          <w:color w:val="8A0027"/>
+        </w:rPr>
+      </w:pPr>
+      <w:r>
+        <w:br w:type="page"/>
+      </w:r>
+    </w:p>
+    <w:p>
+      <w:pPr>
         <w:pStyle w:val="SubSection"/>
       </w:pPr>
       <w:r>
+        <w:lastRenderedPageBreak/>
         <w:t>15.2.3</w:t>
       </w:r>
       <w:r>
@@ -45175,7 +45398,6 @@
         <w:pStyle w:val="SubSection"/>
       </w:pPr>
       <w:r>
-        <w:lastRenderedPageBreak/>
         <w:t>15.2.4</w:t>
       </w:r>
       <w:r>
@@ -45274,6 +45496,7 @@
         <w:pStyle w:val="SubSection"/>
       </w:pPr>
       <w:r>
+        <w:lastRenderedPageBreak/>
         <w:t>15.2.5</w:t>
       </w:r>
       <w:r>
@@ -45332,7 +45555,6 @@
       </w:pPr>
       <w:bookmarkStart w:id="160" w:name="_Toc241456062"/>
       <w:r>
-        <w:lastRenderedPageBreak/>
         <w:t>15.</w:t>
       </w:r>
       <w:r>
@@ -49853,7 +50075,7 @@
         <w:tabs>
           <w:tab w:val="left" w:pos="567"/>
         </w:tabs>
-        <w:spacing w:after="0"/>
+        <w:spacing w:before="80" w:after="0"/>
         <w:ind w:left="0" w:right="-94"/>
         <w:jc w:val="left"/>
         <w:rPr>
@@ -49907,7 +50129,7 @@
         <w:tabs>
           <w:tab w:val="left" w:pos="567"/>
         </w:tabs>
-        <w:spacing w:after="0"/>
+        <w:spacing w:before="80" w:after="0"/>
         <w:ind w:left="0" w:right="-94"/>
         <w:jc w:val="left"/>
         <w:rPr>
@@ -49955,7 +50177,7 @@
         <w:tabs>
           <w:tab w:val="left" w:pos="567"/>
         </w:tabs>
-        <w:spacing w:after="0"/>
+        <w:spacing w:before="80" w:after="0"/>
         <w:ind w:left="0" w:right="-94"/>
         <w:jc w:val="left"/>
         <w:rPr>
@@ -50009,7 +50231,7 @@
         <w:tabs>
           <w:tab w:val="left" w:pos="567"/>
         </w:tabs>
-        <w:spacing w:after="0"/>
+        <w:spacing w:before="80" w:after="0"/>
         <w:ind w:left="0" w:right="-94"/>
         <w:jc w:val="left"/>
         <w:rPr>
@@ -50057,7 +50279,7 @@
         <w:tabs>
           <w:tab w:val="left" w:pos="567"/>
         </w:tabs>
-        <w:spacing w:after="0"/>
+        <w:spacing w:before="80" w:after="0"/>
         <w:ind w:left="0" w:right="-94"/>
         <w:jc w:val="left"/>
         <w:rPr>
@@ -50105,7 +50327,7 @@
         <w:tabs>
           <w:tab w:val="left" w:pos="567"/>
         </w:tabs>
-        <w:spacing w:after="0"/>
+        <w:spacing w:before="80" w:after="0"/>
         <w:ind w:left="0" w:right="-94"/>
         <w:jc w:val="left"/>
         <w:rPr>
@@ -50153,7 +50375,7 @@
         <w:tabs>
           <w:tab w:val="left" w:pos="567"/>
         </w:tabs>
-        <w:spacing w:after="0"/>
+        <w:spacing w:before="80" w:after="0"/>
         <w:ind w:left="0" w:right="-94"/>
         <w:jc w:val="left"/>
         <w:rPr>
@@ -50202,7 +50424,7 @@
         <w:tabs>
           <w:tab w:val="left" w:pos="567"/>
         </w:tabs>
-        <w:spacing w:after="0"/>
+        <w:spacing w:before="80" w:after="0"/>
         <w:ind w:left="0" w:right="-94"/>
         <w:jc w:val="left"/>
         <w:rPr>
@@ -50250,7 +50472,7 @@
         <w:tabs>
           <w:tab w:val="left" w:pos="567"/>
         </w:tabs>
-        <w:spacing w:after="0"/>
+        <w:spacing w:before="80" w:after="0"/>
         <w:ind w:left="0" w:right="-94"/>
         <w:jc w:val="left"/>
         <w:rPr>
@@ -50298,7 +50520,7 @@
         <w:tabs>
           <w:tab w:val="left" w:pos="567"/>
         </w:tabs>
-        <w:spacing w:after="0"/>
+        <w:spacing w:before="80" w:after="0"/>
         <w:ind w:left="0" w:right="-94"/>
         <w:jc w:val="left"/>
         <w:rPr>
@@ -50346,7 +50568,7 @@
         <w:tabs>
           <w:tab w:val="left" w:pos="567"/>
         </w:tabs>
-        <w:spacing w:after="0"/>
+        <w:spacing w:before="80" w:after="0"/>
         <w:ind w:left="0" w:right="-94"/>
         <w:jc w:val="left"/>
         <w:rPr>
@@ -50394,7 +50616,7 @@
         <w:tabs>
           <w:tab w:val="left" w:pos="567"/>
         </w:tabs>
-        <w:spacing w:after="0"/>
+        <w:spacing w:before="80" w:after="0"/>
         <w:ind w:left="0" w:right="-94"/>
         <w:jc w:val="left"/>
         <w:rPr>
@@ -50442,7 +50664,7 @@
         <w:tabs>
           <w:tab w:val="left" w:pos="567"/>
         </w:tabs>
-        <w:spacing w:after="0"/>
+        <w:spacing w:before="80" w:after="0"/>
         <w:ind w:left="0" w:right="-94"/>
         <w:jc w:val="left"/>
         <w:rPr>
@@ -50490,7 +50712,7 @@
         <w:tabs>
           <w:tab w:val="left" w:pos="567"/>
         </w:tabs>
-        <w:spacing w:after="0"/>
+        <w:spacing w:before="80" w:after="0"/>
         <w:ind w:left="0" w:right="-94"/>
         <w:jc w:val="left"/>
         <w:rPr>
@@ -50538,7 +50760,7 @@
         <w:tabs>
           <w:tab w:val="left" w:pos="567"/>
         </w:tabs>
-        <w:spacing w:after="0"/>
+        <w:spacing w:before="80" w:after="0"/>
         <w:ind w:left="0" w:right="-94"/>
         <w:jc w:val="left"/>
         <w:rPr>
@@ -50586,7 +50808,7 @@
         <w:tabs>
           <w:tab w:val="left" w:pos="567"/>
         </w:tabs>
-        <w:spacing w:after="0"/>
+        <w:spacing w:before="80" w:after="0"/>
         <w:ind w:left="0" w:right="-94"/>
         <w:jc w:val="left"/>
         <w:rPr>
@@ -50634,7 +50856,7 @@
         <w:tabs>
           <w:tab w:val="left" w:pos="567"/>
         </w:tabs>
-        <w:spacing w:after="0"/>
+        <w:spacing w:before="80" w:after="0"/>
         <w:ind w:left="0" w:right="-94"/>
         <w:jc w:val="left"/>
         <w:rPr>
@@ -50682,7 +50904,7 @@
         <w:tabs>
           <w:tab w:val="left" w:pos="567"/>
         </w:tabs>
-        <w:spacing w:after="0"/>
+        <w:spacing w:before="80" w:after="0"/>
         <w:ind w:left="0" w:right="-94"/>
         <w:jc w:val="left"/>
         <w:rPr>
@@ -50730,7 +50952,7 @@
         <w:tabs>
           <w:tab w:val="left" w:pos="567"/>
         </w:tabs>
-        <w:spacing w:after="0"/>
+        <w:spacing w:before="80" w:after="0"/>
         <w:ind w:left="0" w:right="-94"/>
         <w:jc w:val="left"/>
         <w:rPr>
@@ -50741,6 +50963,7 @@
         <w:rPr>
           <w:color w:val="auto"/>
         </w:rPr>
+        <w:lastRenderedPageBreak/>
         <w:t xml:space="preserve">Amazon Web Services. </w:t>
       </w:r>
       <w:r>
@@ -50778,7 +51001,7 @@
         <w:tabs>
           <w:tab w:val="left" w:pos="567"/>
         </w:tabs>
-        <w:spacing w:after="0"/>
+        <w:spacing w:before="80" w:after="0"/>
         <w:ind w:left="0" w:right="-94"/>
         <w:jc w:val="left"/>
         <w:rPr>
@@ -50789,7 +51012,6 @@
         <w:rPr>
           <w:color w:val="auto"/>
         </w:rPr>
-        <w:lastRenderedPageBreak/>
         <w:t xml:space="preserve">Amazon Web Services. </w:t>
       </w:r>
       <w:r>
@@ -50827,7 +51049,7 @@
         <w:tabs>
           <w:tab w:val="left" w:pos="567"/>
         </w:tabs>
-        <w:spacing w:after="0"/>
+        <w:spacing w:before="80" w:after="0"/>
         <w:ind w:left="0" w:right="-94"/>
         <w:jc w:val="left"/>
         <w:rPr>
@@ -50875,7 +51097,7 @@
         <w:tabs>
           <w:tab w:val="left" w:pos="567"/>
         </w:tabs>
-        <w:spacing w:after="0"/>
+        <w:spacing w:before="80" w:after="0"/>
         <w:ind w:left="0" w:right="-94"/>
         <w:jc w:val="left"/>
         <w:rPr>
@@ -50929,7 +51151,7 @@
         <w:tabs>
           <w:tab w:val="left" w:pos="567"/>
         </w:tabs>
-        <w:spacing w:after="0"/>
+        <w:spacing w:before="80" w:after="0"/>
         <w:ind w:left="0" w:right="-94"/>
         <w:jc w:val="left"/>
         <w:rPr>
@@ -50977,7 +51199,7 @@
         <w:tabs>
           <w:tab w:val="left" w:pos="567"/>
         </w:tabs>
-        <w:spacing w:after="0"/>
+        <w:spacing w:before="80" w:after="0"/>
         <w:ind w:left="0" w:right="-94"/>
         <w:jc w:val="left"/>
         <w:rPr>
@@ -51025,7 +51247,7 @@
         <w:tabs>
           <w:tab w:val="left" w:pos="567"/>
         </w:tabs>
-        <w:spacing w:after="0"/>
+        <w:spacing w:before="80" w:after="0"/>
         <w:ind w:left="0" w:right="-94"/>
         <w:jc w:val="left"/>
         <w:rPr>
@@ -51073,7 +51295,7 @@
         <w:tabs>
           <w:tab w:val="left" w:pos="567"/>
         </w:tabs>
-        <w:spacing w:after="0"/>
+        <w:spacing w:before="80" w:after="0"/>
         <w:ind w:left="0" w:right="-94"/>
         <w:jc w:val="left"/>
         <w:rPr>
@@ -51121,7 +51343,7 @@
         <w:tabs>
           <w:tab w:val="left" w:pos="567"/>
         </w:tabs>
-        <w:spacing w:after="0"/>
+        <w:spacing w:before="80" w:after="0"/>
         <w:ind w:left="0" w:right="-94"/>
         <w:jc w:val="left"/>
         <w:rPr>
@@ -51169,7 +51391,7 @@
         <w:tabs>
           <w:tab w:val="left" w:pos="567"/>
         </w:tabs>
-        <w:spacing w:after="0"/>
+        <w:spacing w:before="80" w:after="0"/>
         <w:ind w:left="0" w:right="-94"/>
         <w:jc w:val="left"/>
         <w:rPr>
@@ -51223,7 +51445,7 @@
         <w:tabs>
           <w:tab w:val="left" w:pos="567"/>
         </w:tabs>
-        <w:spacing w:after="0"/>
+        <w:spacing w:before="80" w:after="0"/>
         <w:ind w:left="0" w:right="-94"/>
         <w:jc w:val="left"/>
         <w:rPr>
@@ -51255,7 +51477,7 @@
         <w:tabs>
           <w:tab w:val="left" w:pos="567"/>
         </w:tabs>
-        <w:spacing w:after="0"/>
+        <w:spacing w:before="80" w:after="0"/>
         <w:ind w:left="0" w:right="-94"/>
         <w:jc w:val="left"/>
         <w:rPr>
@@ -51303,7 +51525,7 @@
         <w:tabs>
           <w:tab w:val="left" w:pos="567"/>
         </w:tabs>
-        <w:spacing w:after="0"/>
+        <w:spacing w:before="80" w:after="0"/>
         <w:ind w:left="0" w:right="-94"/>
         <w:jc w:val="left"/>
         <w:rPr>
@@ -51365,7 +51587,7 @@
         <w:tabs>
           <w:tab w:val="left" w:pos="567"/>
         </w:tabs>
-        <w:spacing w:after="0"/>
+        <w:spacing w:before="80" w:after="0"/>
         <w:ind w:left="0" w:right="-94"/>
         <w:jc w:val="left"/>
         <w:rPr>
@@ -51413,7 +51635,7 @@
         <w:tabs>
           <w:tab w:val="left" w:pos="567"/>
         </w:tabs>
-        <w:spacing w:after="0"/>
+        <w:spacing w:before="80" w:after="0"/>
         <w:ind w:left="0" w:right="-94"/>
         <w:jc w:val="left"/>
         <w:rPr>
@@ -51424,6 +51646,7 @@
         <w:rPr>
           <w:color w:val="auto"/>
         </w:rPr>
+        <w:lastRenderedPageBreak/>
         <w:t xml:space="preserve">pytest Development Team. </w:t>
       </w:r>
       <w:r>
@@ -51461,7 +51684,7 @@
         <w:tabs>
           <w:tab w:val="left" w:pos="567"/>
         </w:tabs>
-        <w:spacing w:after="0"/>
+        <w:spacing w:before="80" w:after="0"/>
         <w:ind w:left="0" w:right="-94"/>
         <w:jc w:val="left"/>
         <w:rPr>
@@ -51509,7 +51732,7 @@
         <w:tabs>
           <w:tab w:val="left" w:pos="567"/>
         </w:tabs>
-        <w:spacing w:after="0"/>
+        <w:spacing w:before="80" w:after="0"/>
         <w:ind w:left="0" w:right="-94"/>
         <w:jc w:val="left"/>
         <w:rPr>
@@ -51520,7 +51743,6 @@
         <w:rPr>
           <w:color w:val="auto"/>
         </w:rPr>
-        <w:lastRenderedPageBreak/>
         <w:t xml:space="preserve">Sebastián Ramírez. </w:t>
       </w:r>
       <w:r>
@@ -60708,12 +60930,12 @@
     <w:uiPriority w:val="35"/>
     <w:unhideWhenUsed/>
     <w:qFormat/>
-    <w:rsid w:val="00B17279"/>
+    <w:rsid w:val="006A14E3"/>
     <w:pPr>
       <w:tabs>
         <w:tab w:val="left" w:pos="567"/>
       </w:tabs>
-      <w:spacing w:after="0" w:line="240" w:lineRule="auto"/>
+      <w:spacing w:after="240" w:line="240" w:lineRule="auto"/>
       <w:ind w:left="720" w:right="-94"/>
       <w:jc w:val="center"/>
     </w:pPr>
@@ -61026,7 +61248,7 @@
     <w:link w:val="SubSectionChar"/>
     <w:autoRedefine/>
     <w:qFormat/>
-    <w:rsid w:val="00965E14"/>
+    <w:rsid w:val="006A14E3"/>
     <w:pPr>
       <w:tabs>
         <w:tab w:val="left" w:pos="567"/>
@@ -61039,7 +61261,7 @@
     <w:name w:val="SubSection Char"/>
     <w:basedOn w:val="Heading1Char"/>
     <w:link w:val="SubSection"/>
-    <w:rsid w:val="00965E14"/>
+    <w:rsid w:val="006A14E3"/>
     <w:rPr>
       <w:rFonts w:ascii="Calibri" w:eastAsia="Calibri" w:hAnsi="Calibri" w:cs="Calibri"/>
       <w:b/>

</xml_diff>